<commit_message>
build: final paper artifacts for JMIR submission
All formats rebuilt and verified:
- PDF (272K, 20 pages), HTML (312K), DOCX (208K), LaTeX (92K)
- Multimedia appendices 1 and 2 (PDF/HTML/DOCX)

Final checks passed:
- JMIR word count: 4,952 / 5,000
- JMIR compliance: COMPLIANT
- No em-dashes, no old terms (HiL-SG, ARI, Semantic Governance)
- Figures render with legible text, grayscale, print-ready
- All sections, tables, and references verified

Refs #506

Co-Authored-By: Claude Opus 4.6 (1M context) <noreply@anthropic.com>
</commit_message>
<xml_diff>
--- a/paper.docx
+++ b/paper.docx
@@ -80,7 +80,7 @@
         <w:t xml:space="preserve">“Socialization Failure”</w:t>
       </w:r>
       <w:r>
-        <w:t xml:space="preserve">: high turnover fractures the social networks required for mentorship, rendering the traditional apprenticeship model of informatics unsustainable. To address this failure, we employ a Design Science Research (DSR) approach, synthesizing evidence from healthcare informatics, knowledge management, and natural language processing (2024-2026 workforce and NL2SQL literature) to develop a socio-technical framework called Human-in-the-Loop Semantic Governance (HiL-SG).</w:t>
+        <w:t xml:space="preserve">: high turnover fractures the social networks required for mentorship, rendering the traditional apprenticeship model of informatics unsustainable. To address this failure, we employ a Design Science Research (DSR) approach, synthesizing evidence from healthcare informatics, knowledge management, and natural language processing (2024-2026 workforce and NL2SQL literature) to develop a socio-technical framework called Human-in-the-Loop Knowledge Governance (HITL-KG).</w:t>
       </w:r>
     </w:p>
     <w:p>
@@ -88,7 +88,7 @@
         <w:pStyle w:val="Abstract"/>
       </w:pPr>
       <w:r>
-        <w:t xml:space="preserve">HiL-SG is designed to shift the locus of organizational knowledge from volatile human memory to durable semantic artifacts called</w:t>
+        <w:t xml:space="preserve">HITL-KG is designed to shift the locus of organizational knowledge from volatile human memory to durable semantic artifacts called</w:t>
       </w:r>
       <w:r>
         <w:t xml:space="preserve"> </w:t>
@@ -100,7 +100,7 @@
         <w:t xml:space="preserve"> </w:t>
       </w:r>
       <w:r>
-        <w:t xml:space="preserve">each comprising a natural language intent, executable SQL, and rationale metadata. By embedding knowledge capture into the daily workflow of query generation, the framework aims to convert the ephemeral act of analytics into permanent institutional assets. The accompanying Analytics Resilience Index (ARI) proposes a measurement instrument that extends static maturity assessments with a complementary resilience dimension, quantifying an organization’s ability to sustain analytical capability despite staff churn.</w:t>
+        <w:t xml:space="preserve">each comprising a natural language intent, executable SQL, and rationale metadata. By embedding knowledge capture into the daily workflow of query generation, the framework aims to convert the ephemeral act of analytics into permanent institutional assets. The accompanying Three-Pillar Assessment Rubric provides a structured self-assessment tool that enables organizations to identify compounding vulnerabilities across analytics maturity, workforce agility, and technical enablement.</w:t>
       </w:r>
     </w:p>
     <w:p>
@@ -718,7 +718,7 @@
           <w:b/>
           <w:bCs/>
         </w:rPr>
-        <w:t xml:space="preserve">Human-in-the-Loop Semantic Governance (HiL-SG)</w:t>
+        <w:t xml:space="preserve">Human-in-the-Loop Knowledge Governance (HITL-KG)</w:t>
       </w:r>
       <w:r>
         <w:t xml:space="preserve">.</w:t>
@@ -912,7 +912,7 @@
         <w:pStyle w:val="BodyText"/>
       </w:pPr>
       <w:r>
-        <w:t xml:space="preserve">The three-pillar structure aligns with established models across healthcare informatics and knowledge management:</w:t>
+        <w:t xml:space="preserve">The three-pillar structure aligns with established models across healthcare informatics and knowledge management (Table 1):</w:t>
       </w:r>
     </w:p>
     <w:p>
@@ -1728,7 +1728,7 @@
     </w:p>
     <w:bookmarkEnd w:id="11"/>
     <w:bookmarkEnd w:id="12"/>
-    <w:bookmarkStart w:id="22" w:name="human-in-the-loop-semantic-governance"/>
+    <w:bookmarkStart w:id="22" w:name="human-in-the-loop-knowledge-governance"/>
     <w:p>
       <w:pPr>
         <w:pStyle w:val="Heading1"/>
@@ -1743,7 +1743,7 @@
         <w:tab/>
       </w:r>
       <w:r>
-        <w:t xml:space="preserve">Human-in-the-Loop Semantic Governance</w:t>
+        <w:t xml:space="preserve">Human-in-the-Loop Knowledge Governance</w:t>
       </w:r>
     </w:p>
     <w:p>
@@ -1751,19 +1751,7 @@
         <w:pStyle w:val="FirstParagraph"/>
       </w:pPr>
       <w:r>
-        <w:t xml:space="preserve">We rename the traditional</w:t>
-      </w:r>
-      <w:r>
-        <w:t xml:space="preserve"> </w:t>
-      </w:r>
-      <w:r>
-        <w:t xml:space="preserve">“Validated Query Cycle”</w:t>
-      </w:r>
-      <w:r>
-        <w:t xml:space="preserve"> </w:t>
-      </w:r>
-      <w:r>
-        <w:t xml:space="preserve">to</w:t>
+        <w:t xml:space="preserve">We propose</w:t>
       </w:r>
       <w:r>
         <w:t xml:space="preserve"> </w:t>
@@ -1773,16 +1761,39 @@
           <w:b/>
           <w:bCs/>
         </w:rPr>
-        <w:t xml:space="preserve">Human-in-the-Loop Semantic Governance (HiL-SG)</w:t>
-      </w:r>
-      <w:r>
-        <w:t xml:space="preserve"> </w:t>
-      </w:r>
-      <w:r>
-        <w:t xml:space="preserve">to reflect its role as a governance mechanism rather than just a productivity tool.</w:t>
-      </w:r>
-    </w:p>
-    <w:bookmarkStart w:id="19" w:name="the-hil-sg-architecture"/>
+        <w:t xml:space="preserve">Human-in-the-Loop Knowledge Governance (HITL-KG)</w:t>
+      </w:r>
+      <w:r>
+        <w:t xml:space="preserve"> </w:t>
+      </w:r>
+      <w:r>
+        <w:t xml:space="preserve">as the overarching governance framework, extending the knowledge governance approach</w:t>
+      </w:r>
+      <w:r>
+        <w:t xml:space="preserve"> </w:t>
+      </w:r>
+      <w:r>
+        <w:t xml:space="preserve">(</w:t>
+      </w:r>
+      <w:hyperlink w:anchor="ref-foss2007">
+        <w:r>
+          <w:rPr>
+            <w:rStyle w:val="Hyperlink"/>
+          </w:rPr>
+          <w:t xml:space="preserve">27</w:t>
+        </w:r>
+      </w:hyperlink>
+      <w:r>
+        <w:t xml:space="preserve">)</w:t>
+      </w:r>
+      <w:r>
+        <w:t xml:space="preserve"> </w:t>
+      </w:r>
+      <w:r>
+        <w:t xml:space="preserve">with the Validated Query Cycle as its core operational process. This framing reflects that the system serves as a governance mechanism, not just a productivity tool.</w:t>
+      </w:r>
+    </w:p>
+    <w:bookmarkStart w:id="19" w:name="the-hitl-kg-architecture"/>
     <w:p>
       <w:pPr>
         <w:pStyle w:val="Heading2"/>
@@ -1797,7 +1808,7 @@
         <w:tab/>
       </w:r>
       <w:r>
-        <w:t xml:space="preserve">The HiL-SG Architecture</w:t>
+        <w:t xml:space="preserve">The HITL-KG Architecture</w:t>
       </w:r>
     </w:p>
     <w:p>
@@ -1805,7 +1816,7 @@
         <w:pStyle w:val="FirstParagraph"/>
       </w:pPr>
       <w:r>
-        <w:t xml:space="preserve">The HiL-SG architecture (Figure 1) functions as a</w:t>
+        <w:t xml:space="preserve">The HITL-KG architecture (Figure 1) functions as a</w:t>
       </w:r>
       <w:r>
         <w:t xml:space="preserve"> </w:t>
@@ -1842,7 +1853,7 @@
           <wp:inline>
             <wp:extent cx="5067300" cy="5062370"/>
             <wp:effectExtent b="0" l="0" r="0" t="0"/>
-            <wp:docPr descr="Flowchart of the Healthcare Analytics Architecture as a Socio-Technical System. A Clinical User submits a natural language query (step 1) to a Conversational AI with NLP Engine and SQL Generation, which generates SQL and queries the Healthcare Data Warehouse (steps 2-3). The system then presents its logic to an Expert Validation decision point (step 4), which either confirms and delivers insights back to the user (steps 5-6) or loops back for correction. On confirmation, the validated query triple is stored in Organizational Memory (step 7, dashed line), which informs future queries alongside a Knowledge Base of ontologies and best practices." title="" id="14" name="Picture"/>
+            <wp:docPr descr="Human-in-the-Loop Knowledge Governance (HITL-KG) Architecture. A Clinical User submits a natural language query (step 1) to a Conversational AI with NLP Engine and SQL Generation, which generates SQL and queries the Healthcare Data Warehouse (steps 2-3). The system then presents its logic to an Expert Validation decision point (step 4), which either confirms and delivers insights back to the user (steps 5-6) or loops back for correction. On confirmation, the validated query triple is stored in Organizational Memory (step 7, dashed line), which informs future queries alongside a Knowledge Base of ontologies and best practices." title="" id="14" name="Picture"/>
             <a:graphic>
               <a:graphicData uri="http://schemas.openxmlformats.org/drawingml/2006/picture">
                 <pic:pic>
@@ -1885,7 +1896,7 @@
         <w:pStyle w:val="ImageCaption"/>
       </w:pPr>
       <w:r>
-        <w:t xml:space="preserve">Flowchart of the Healthcare Analytics Architecture as a Socio-Technical System. A Clinical User submits a natural language query (step 1) to a Conversational AI with NLP Engine and SQL Generation, which generates SQL and queries the Healthcare Data Warehouse (steps 2-3). The system then presents its logic to an Expert Validation decision point (step 4), which either confirms and delivers insights back to the user (steps 5-6) or loops back for correction. On confirmation, the validated query triple is stored in Organizational Memory (step 7, dashed line), which informs future queries alongside a Knowledge Base of ontologies and best practices.</w:t>
+        <w:t xml:space="preserve">Human-in-the-Loop Knowledge Governance (HITL-KG) Architecture. A Clinical User submits a natural language query (step 1) to a Conversational AI with NLP Engine and SQL Generation, which generates SQL and queries the Healthcare Data Warehouse (steps 2-3). The system then presents its logic to an Expert Validation decision point (step 4), which either confirms and delivers insights back to the user (steps 5-6) or loops back for correction. On confirmation, the validated query triple is stored in Organizational Memory (step 7, dashed line), which informs future queries alongside a Knowledge Base of ontologies and best practices.</w:t>
       </w:r>
     </w:p>
     <w:p>
@@ -1903,9 +1914,9 @@
       <w:r>
         <w:drawing>
           <wp:inline>
-            <wp:extent cx="4267200" cy="9456573"/>
+            <wp:extent cx="4267200" cy="7697062"/>
             <wp:effectExtent b="0" l="0" r="0" t="0"/>
-            <wp:docPr descr="Flowchart of the six-step Validated Query Cycle for Human-in-the-Loop Semantic Governance. Step 1 (Query): domain expert asks a natural language question. Step 2 (Generation): system generates candidate SQL. Step 3 (Validation): AI explains SQL logic and results; expert confirms intent. If incorrect, the cycle loops back to Generation. If correct, Step 4 (Storage): validated triple is stored in organizational memory. Step 5 (Retrieval): future queries match against validated triples. Step 6 (Persistence): knowledge survives staff turnover, and new experts reuse validated queries. Dashed arrows connect the cycle to three outcome pillars: Storage advances Analytics Maturity, Persistence stabilizes Workforce Agility, and Retrieval increases Technical Enablement." title="" id="17" name="Picture"/>
+            <wp:docPr descr="Flowchart of the six-step Validated Query Cycle for Human-in-the-Loop Knowledge Governance. Step 1 (Query): analyst asks a natural language question. Step 2 (Generation): system generates candidate SQL. Step 3 (Validation): AI explains SQL logic and results; analyst confirms intent. If incorrect, the cycle loops back to Generation. If correct, Step 4 (Storage): validated triple is stored in organizational memory. Step 5 (Retrieval): future queries match against validated triples. Step 6 (Persistence): knowledge survives staff turnover, and new analysts reuse validated queries. Dashed arrows connect the cycle to three outcome pillars: Storage advances Analytics Maturity, Persistence stabilizes Workforce Agility, and Retrieval increases Technical Enablement." title="" id="17" name="Picture"/>
             <a:graphic>
               <a:graphicData uri="http://schemas.openxmlformats.org/drawingml/2006/picture">
                 <pic:pic>
@@ -1924,7 +1935,7 @@
                   <pic:spPr bwMode="auto">
                     <a:xfrm>
                       <a:off x="0" y="0"/>
-                      <a:ext cx="4267200" cy="9456573"/>
+                      <a:ext cx="4267200" cy="7697062"/>
                     </a:xfrm>
                     <a:prstGeom prst="rect">
                       <a:avLst/>
@@ -1948,7 +1959,7 @@
         <w:pStyle w:val="ImageCaption"/>
       </w:pPr>
       <w:r>
-        <w:t xml:space="preserve">Flowchart of the six-step Validated Query Cycle for Human-in-the-Loop Semantic Governance. Step 1 (Query): domain expert asks a natural language question. Step 2 (Generation): system generates candidate SQL. Step 3 (Validation): AI explains SQL logic and results; expert confirms intent. If incorrect, the cycle loops back to Generation. If correct, Step 4 (Storage): validated triple is stored in organizational memory. Step 5 (Retrieval): future queries match against validated triples. Step 6 (Persistence): knowledge survives staff turnover, and new experts reuse validated queries. Dashed arrows connect the cycle to three outcome pillars: Storage advances Analytics Maturity, Persistence stabilizes Workforce Agility, and Retrieval increases Technical Enablement.</w:t>
+        <w:t xml:space="preserve">Flowchart of the six-step Validated Query Cycle for Human-in-the-Loop Knowledge Governance. Step 1 (Query): analyst asks a natural language question. Step 2 (Generation): system generates candidate SQL. Step 3 (Validation): AI explains SQL logic and results; analyst confirms intent. If incorrect, the cycle loops back to Generation. If correct, Step 4 (Storage): validated triple is stored in organizational memory. Step 5 (Retrieval): future queries match against validated triples. Step 6 (Persistence): knowledge survives staff turnover, and new analysts reuse validated queries. Dashed arrows connect the cycle to three outcome pillars: Storage advances Analytics Maturity, Persistence stabilizes Workforce Agility, and Retrieval increases Technical Enablement.</w:t>
       </w:r>
     </w:p>
     <w:bookmarkEnd w:id="19"/>
@@ -2010,7 +2021,7 @@
           <w:rPr>
             <w:rStyle w:val="Hyperlink"/>
           </w:rPr>
-          <w:t xml:space="preserve">27</w:t>
+          <w:t xml:space="preserve">28</w:t>
         </w:r>
       </w:hyperlink>
       <w:r>
@@ -2049,7 +2060,7 @@
           <w:rPr>
             <w:rStyle w:val="Hyperlink"/>
           </w:rPr>
-          <w:t xml:space="preserve">28</w:t>
+          <w:t xml:space="preserve">29</w:t>
         </w:r>
       </w:hyperlink>
       <w:r>
@@ -2097,13 +2108,13 @@
         <w:t xml:space="preserve"> </w:t>
       </w:r>
       <w:r>
-        <w:t xml:space="preserve">“Human-on-the-Loop”</w:t>
-      </w:r>
-      <w:r>
-        <w:t xml:space="preserve"> </w:t>
-      </w:r>
-      <w:r>
-        <w:t xml:space="preserve">(HotL) step transforms validation into an iterative knowledge capture process</w:t>
+        <w:t xml:space="preserve">“Human-in-the-Loop”</w:t>
+      </w:r>
+      <w:r>
+        <w:t xml:space="preserve"> </w:t>
+      </w:r>
+      <w:r>
+        <w:t xml:space="preserve">(HITL) step transforms validation into an iterative knowledge capture process</w:t>
       </w:r>
       <w:r>
         <w:t xml:space="preserve"> </w:t>
@@ -2116,7 +2127,7 @@
           <w:rPr>
             <w:rStyle w:val="Hyperlink"/>
           </w:rPr>
-          <w:t xml:space="preserve">29</w:t>
+          <w:t xml:space="preserve">30</w:t>
         </w:r>
       </w:hyperlink>
       <w:r>
@@ -2127,7 +2138,7 @@
           <w:rPr>
             <w:rStyle w:val="Hyperlink"/>
           </w:rPr>
-          <w:t xml:space="preserve">30</w:t>
+          <w:t xml:space="preserve">31</w:t>
         </w:r>
       </w:hyperlink>
       <w:r>
@@ -2166,7 +2177,7 @@
           <w:rPr>
             <w:rStyle w:val="Hyperlink"/>
           </w:rPr>
-          <w:t xml:space="preserve">31</w:t>
+          <w:t xml:space="preserve">32</w:t>
         </w:r>
       </w:hyperlink>
       <w:r>
@@ -2237,7 +2248,7 @@
           <w:rPr>
             <w:rStyle w:val="Hyperlink"/>
           </w:rPr>
-          <w:t xml:space="preserve">32</w:t>
+          <w:t xml:space="preserve">33</w:t>
         </w:r>
       </w:hyperlink>
       <w:r>
@@ -2271,7 +2282,7 @@
         <w:pStyle w:val="FirstParagraph"/>
       </w:pPr>
       <w:r>
-        <w:t xml:space="preserve">Organizations have attempted to address institutional memory loss through several strategies, each with limitations that HiL-SG is designed to overcome.</w:t>
+        <w:t xml:space="preserve">Organizations have attempted to address institutional memory loss through several strategies, each with limitations that HITL-KG is designed to overcome.</w:t>
       </w:r>
     </w:p>
     <w:p>
@@ -2314,7 +2325,7 @@
           <w:rPr>
             <w:rStyle w:val="Hyperlink"/>
           </w:rPr>
-          <w:t xml:space="preserve">33</w:t>
+          <w:t xml:space="preserve">34</w:t>
         </w:r>
       </w:hyperlink>
       <w:r>
@@ -2325,14 +2336,14 @@
           <w:rPr>
             <w:rStyle w:val="Hyperlink"/>
           </w:rPr>
-          <w:t xml:space="preserve">34</w:t>
+          <w:t xml:space="preserve">35</w:t>
         </w:r>
       </w:hyperlink>
       <w:r>
         <w:t xml:space="preserve">)</w:t>
       </w:r>
       <w:r>
-        <w:t xml:space="preserve">. HiL-SG’s validated query triples share the version-control principle but add the rationale metadata that semantic layers lack: not just</w:t>
+        <w:t xml:space="preserve">. HITL-KG’s validated query triples share the version-control principle but add the rationale metadata that semantic layers lack: not just</w:t>
       </w:r>
       <w:r>
         <w:t xml:space="preserve"> </w:t>
@@ -2413,7 +2424,7 @@
         <w:t xml:space="preserve">)</w:t>
       </w:r>
       <w:r>
-        <w:t xml:space="preserve">. HiL-SG instead implements active capture: the query itself is the documentation, and validation happens at the point of use rather than as a separate maintenance task</w:t>
+        <w:t xml:space="preserve">. HITL-KG instead implements active capture: the query itself is the documentation, and validation happens at the point of use rather than as a separate maintenance task</w:t>
       </w:r>
       <w:r>
         <w:t xml:space="preserve"> </w:t>
@@ -2464,14 +2475,14 @@
           <w:rPr>
             <w:rStyle w:val="Hyperlink"/>
           </w:rPr>
-          <w:t xml:space="preserve">28</w:t>
+          <w:t xml:space="preserve">29</w:t>
         </w:r>
       </w:hyperlink>
       <w:r>
         <w:t xml:space="preserve">)</w:t>
       </w:r>
       <w:r>
-        <w:t xml:space="preserve">. HiL-SG occupies the middle ground, using AI as the generation engine while preserving human judgment as the validation gate.</w:t>
+        <w:t xml:space="preserve">. HITL-KG occupies the middle ground, using AI as the generation engine while preserving human judgment as the validation gate.</w:t>
       </w:r>
     </w:p>
     <w:bookmarkEnd w:id="21"/>
@@ -2499,7 +2510,7 @@
         <w:pStyle w:val="FirstParagraph"/>
       </w:pPr>
       <w:r>
-        <w:t xml:space="preserve">The evidence presented below supports the existence and severity of the problem HiL-SG addresses, and the maturity of the technologies it requires. It does not constitute empirical validation of the framework itself, which remains a theoretically grounded, testable proposition whose empirical evaluation is the subject of Paper 2.</w:t>
+        <w:t xml:space="preserve">The evidence presented below supports the existence and severity of the problem HITL-KG addresses, and the maturity of the technologies it requires. It does not constitute empirical validation of the framework itself, which remains a theoretically grounded, testable proposition whose empirical evaluation is the subject of future work.</w:t>
       </w:r>
     </w:p>
     <w:p>
@@ -2507,7 +2518,7 @@
         <w:pStyle w:val="BodyText"/>
       </w:pPr>
       <w:r>
-        <w:t xml:space="preserve">The HiL-SG framework is supported by three pillars of empirical evidence synthesized from over 130 sources.</w:t>
+        <w:t xml:space="preserve">The HITL-KG framework is supported by three pillars of empirical evidence synthesized from over 130 sources.</w:t>
       </w:r>
     </w:p>
     <w:bookmarkStart w:id="23" w:name="pillar-1-analytics-maturity-evidence"/>
@@ -2557,7 +2568,7 @@
           <w:rPr>
             <w:rStyle w:val="Hyperlink"/>
           </w:rPr>
-          <w:t xml:space="preserve">35</w:t>
+          <w:t xml:space="preserve">36</w:t>
         </w:r>
       </w:hyperlink>
       <w:r>
@@ -2577,7 +2588,7 @@
           <w:rPr>
             <w:rStyle w:val="Hyperlink"/>
           </w:rPr>
-          <w:t xml:space="preserve">36</w:t>
+          <w:t xml:space="preserve">37</w:t>
         </w:r>
       </w:hyperlink>
       <w:r>
@@ -2597,7 +2608,7 @@
           <w:rPr>
             <w:rStyle w:val="Hyperlink"/>
           </w:rPr>
-          <w:t xml:space="preserve">37</w:t>
+          <w:t xml:space="preserve">38</w:t>
         </w:r>
       </w:hyperlink>
       <w:r>
@@ -2629,7 +2640,7 @@
           <w:rPr>
             <w:rStyle w:val="Hyperlink"/>
           </w:rPr>
-          <w:t xml:space="preserve">38</w:t>
+          <w:t xml:space="preserve">39</w:t>
         </w:r>
       </w:hyperlink>
       <w:r>
@@ -2657,7 +2668,7 @@
           <w:rPr>
             <w:rStyle w:val="Hyperlink"/>
           </w:rPr>
-          <w:t xml:space="preserve">39</w:t>
+          <w:t xml:space="preserve">40</w:t>
         </w:r>
       </w:hyperlink>
       <w:r>
@@ -2677,7 +2688,7 @@
           <w:rPr>
             <w:rStyle w:val="Hyperlink"/>
           </w:rPr>
-          <w:t xml:space="preserve">40</w:t>
+          <w:t xml:space="preserve">41</w:t>
         </w:r>
       </w:hyperlink>
       <w:r>
@@ -2697,7 +2708,7 @@
           <w:rPr>
             <w:rStyle w:val="Hyperlink"/>
           </w:rPr>
-          <w:t xml:space="preserve">41</w:t>
+          <w:t xml:space="preserve">42</w:t>
         </w:r>
       </w:hyperlink>
       <w:r>
@@ -2708,7 +2719,7 @@
           <w:rPr>
             <w:rStyle w:val="Hyperlink"/>
           </w:rPr>
-          <w:t xml:space="preserve">42</w:t>
+          <w:t xml:space="preserve">43</w:t>
         </w:r>
       </w:hyperlink>
       <w:r>
@@ -2766,7 +2777,7 @@
           <w:rPr>
             <w:rStyle w:val="Hyperlink"/>
           </w:rPr>
-          <w:t xml:space="preserve">43</w:t>
+          <w:t xml:space="preserve">44</w:t>
         </w:r>
       </w:hyperlink>
       <w:r>
@@ -2786,7 +2797,7 @@
           <w:rPr>
             <w:rStyle w:val="Hyperlink"/>
           </w:rPr>
-          <w:t xml:space="preserve">44</w:t>
+          <w:t xml:space="preserve">45</w:t>
         </w:r>
       </w:hyperlink>
       <w:r>
@@ -2956,7 +2967,7 @@
           <w:rPr>
             <w:rStyle w:val="Hyperlink"/>
           </w:rPr>
-          <w:t xml:space="preserve">45</w:t>
+          <w:t xml:space="preserve">46</w:t>
         </w:r>
       </w:hyperlink>
       <w:r>
@@ -2976,7 +2987,7 @@
           <w:rPr>
             <w:rStyle w:val="Hyperlink"/>
           </w:rPr>
-          <w:t xml:space="preserve">46</w:t>
+          <w:t xml:space="preserve">47</w:t>
         </w:r>
       </w:hyperlink>
       <w:r>
@@ -2996,7 +3007,7 @@
           <w:rPr>
             <w:rStyle w:val="Hyperlink"/>
           </w:rPr>
-          <w:t xml:space="preserve">47</w:t>
+          <w:t xml:space="preserve">48</w:t>
         </w:r>
       </w:hyperlink>
       <w:r>
@@ -3016,14 +3027,14 @@
           <w:rPr>
             <w:rStyle w:val="Hyperlink"/>
           </w:rPr>
-          <w:t xml:space="preserve">28</w:t>
+          <w:t xml:space="preserve">29</w:t>
         </w:r>
       </w:hyperlink>
       <w:r>
         <w:t xml:space="preserve">)</w:t>
       </w:r>
       <w:r>
-        <w:t xml:space="preserve">, this gradient demonstrates that the generation engine required for HiL-SG is viable within a human-validated workflow. Notably, high benchmark accuracy does not guarantee real-world generalization: evaluation on more challenging dataset splits reveals accuracy drops from 92% to 28%</w:t>
+        <w:t xml:space="preserve">, this gradient demonstrates that the generation engine required for HITL-KG is viable within a human-validated workflow. Notably, high benchmark accuracy does not guarantee real-world generalization: evaluation on more challenging dataset splits reveals accuracy drops from 92% to 28%</w:t>
       </w:r>
       <w:r>
         <w:t xml:space="preserve"> </w:t>
@@ -3036,7 +3047,7 @@
           <w:rPr>
             <w:rStyle w:val="Hyperlink"/>
           </w:rPr>
-          <w:t xml:space="preserve">48</w:t>
+          <w:t xml:space="preserve">49</w:t>
         </w:r>
       </w:hyperlink>
       <w:r>
@@ -3056,7 +3067,7 @@
           <w:rPr>
             <w:rStyle w:val="Hyperlink"/>
           </w:rPr>
-          <w:t xml:space="preserve">49</w:t>
+          <w:t xml:space="preserve">50</w:t>
         </w:r>
       </w:hyperlink>
       <w:r>
@@ -3076,7 +3087,7 @@
           <w:rPr>
             <w:rStyle w:val="Hyperlink"/>
           </w:rPr>
-          <w:t xml:space="preserve">50</w:t>
+          <w:t xml:space="preserve">51</w:t>
         </w:r>
       </w:hyperlink>
       <w:r>
@@ -3122,7 +3133,7 @@
         <w:t xml:space="preserve">)</w:t>
       </w:r>
       <w:r>
-        <w:t xml:space="preserve">. In other words, the technology forces organizational discipline as a precondition for functioning, making it a governance forcing function even before considering the query results. This reframes NL2SQL from a convenience tool into a catalyst for the kind of systematic knowledge externalization that the HiL-SG framework requires. The interface bridges the semantic gap between clinical experts and technical schema, allowing non-technical domain experts to interact with data alongside broader modernization efforts</w:t>
+        <w:t xml:space="preserve">. In other words, the technology forces organizational discipline as a precondition for functioning, making it a governance forcing function even before considering the query results. This reframes NL2SQL from a convenience tool into a catalyst for the kind of systematic knowledge externalization that the HITL-KG framework requires. The interface bridges the semantic gap between clinical experts and technical schema, allowing non-technical domain experts to interact with data alongside broader modernization efforts</w:t>
       </w:r>
       <w:r>
         <w:t xml:space="preserve"> </w:t>
@@ -3135,7 +3146,7 @@
           <w:rPr>
             <w:rStyle w:val="Hyperlink"/>
           </w:rPr>
-          <w:t xml:space="preserve">51</w:t>
+          <w:t xml:space="preserve">52</w:t>
         </w:r>
       </w:hyperlink>
       <w:r>
@@ -3146,7 +3157,7 @@
           <w:rPr>
             <w:rStyle w:val="Hyperlink"/>
           </w:rPr>
-          <w:t xml:space="preserve">54</w:t>
+          <w:t xml:space="preserve">55</w:t>
         </w:r>
       </w:hyperlink>
       <w:r>
@@ -3158,7 +3169,7 @@
     </w:p>
     <w:bookmarkEnd w:id="25"/>
     <w:bookmarkEnd w:id="26"/>
-    <w:bookmarkStart w:id="29" w:name="the-analytics-resilience-index"/>
+    <w:bookmarkStart w:id="29" w:name="organizational-self-assessment"/>
     <w:p>
       <w:pPr>
         <w:pStyle w:val="Heading1"/>
@@ -3173,7 +3184,7 @@
         <w:tab/>
       </w:r>
       <w:r>
-        <w:t xml:space="preserve">The Analytics Resilience Index</w:t>
+        <w:t xml:space="preserve">Organizational Self-Assessment</w:t>
       </w:r>
     </w:p>
     <w:p>
@@ -3181,7 +3192,7 @@
         <w:pStyle w:val="FirstParagraph"/>
       </w:pPr>
       <w:r>
-        <w:t xml:space="preserve">To measure success, we propose the</w:t>
+        <w:t xml:space="preserve">To operationalize the framework, we propose a</w:t>
       </w:r>
       <w:r>
         <w:t xml:space="preserve"> </w:t>
@@ -3191,13 +3202,16 @@
           <w:b/>
           <w:bCs/>
         </w:rPr>
-        <w:t xml:space="preserve">Analytics Resilience Index (ARI)</w:t>
-      </w:r>
-      <w:r>
-        <w:t xml:space="preserve">, extending static maturity assessments with a complementary resilience dimension.</w:t>
-      </w:r>
-    </w:p>
-    <w:bookmarkStart w:id="27" w:name="why-resilience-not-maturity"/>
+        <w:t xml:space="preserve">Three-Pillar Assessment Rubric</w:t>
+      </w:r>
+      <w:r>
+        <w:t xml:space="preserve"> </w:t>
+      </w:r>
+      <w:r>
+        <w:t xml:space="preserve">(Table 2) that enables healthcare organizations to evaluate their current position across each pillar and identify compounding vulnerabilities.</w:t>
+      </w:r>
+    </w:p>
+    <w:bookmarkStart w:id="27" w:name="why-assessment-not-just-maturity"/>
     <w:p>
       <w:pPr>
         <w:pStyle w:val="Heading2"/>
@@ -3212,7 +3226,7 @@
         <w:tab/>
       </w:r>
       <w:r>
-        <w:t xml:space="preserve">Why Resilience, Not Maturity</w:t>
+        <w:t xml:space="preserve">Why Assessment, Not Just Maturity</w:t>
       </w:r>
     </w:p>
     <w:p>
@@ -3220,7 +3234,7 @@
         <w:pStyle w:val="FirstParagraph"/>
       </w:pPr>
       <w:r>
-        <w:t xml:space="preserve">Existing maturity models such as the HIMSS Analytics Maturity Assessment Model (AMAM) assume linear progression through discrete stages and implicitly presuppose a stable workforce capable of sustaining each level once achieved</w:t>
+        <w:t xml:space="preserve">Existing maturity models such as AMAM, the DIKW hierarchy, and established knowledge management frameworks (see Table 1) assume linear progression and implicitly presuppose a stable workforce</w:t>
       </w:r>
       <w:r>
         <w:t xml:space="preserve"> </w:t>
@@ -3251,7 +3265,7 @@
         <w:t xml:space="preserve">)</w:t>
       </w:r>
       <w:r>
-        <w:t xml:space="preserve">. In practice, this assumption is violated routinely. An organization that reaches AMAM Stage 5 but regresses to Stage 3 after the departure of two senior analysts has not failed to mature; it has failed to be</w:t>
+        <w:t xml:space="preserve">. In practice, an organization that reaches AMAM Stage 5 but regresses to Stage 3 after the departure of two senior analysts has not failed to mature; it has failed to be</w:t>
       </w:r>
       <w:r>
         <w:t xml:space="preserve"> </w:t>
@@ -3264,29 +3278,51 @@
         <w:t xml:space="preserve">resilient</w:t>
       </w:r>
       <w:r>
-        <w:t xml:space="preserve">. Static maturity scores capture a snapshot of peak capability but reveal nothing about the organization’s ability to sustain that capability through disruption. The ARI addresses this gap by shifting the measurement focus from</w:t>
-      </w:r>
-      <w:r>
-        <w:t xml:space="preserve"> </w:t>
-      </w:r>
-      <w:r>
-        <w:t xml:space="preserve">“where you are”</w:t>
-      </w:r>
-      <w:r>
-        <w:t xml:space="preserve"> </w:t>
-      </w:r>
-      <w:r>
-        <w:t xml:space="preserve">to</w:t>
-      </w:r>
-      <w:r>
-        <w:t xml:space="preserve"> </w:t>
-      </w:r>
-      <w:r>
-        <w:t xml:space="preserve">“how far you fall when someone leaves.”</w:t>
+        <w:t xml:space="preserve">. A recent systematic review identified 23 distinct organizational resilience instruments applied in health facilities, yet found no consensus on what to measure</w:t>
+      </w:r>
+      <w:r>
+        <w:t xml:space="preserve"> </w:t>
+      </w:r>
+      <w:r>
+        <w:t xml:space="preserve">(</w:t>
+      </w:r>
+      <w:hyperlink w:anchor="ref-ignatowicz2023">
+        <w:r>
+          <w:rPr>
+            <w:rStyle w:val="Hyperlink"/>
+          </w:rPr>
+          <w:t xml:space="preserve">56</w:t>
+        </w:r>
+      </w:hyperlink>
+      <w:r>
+        <w:t xml:space="preserve">)</w:t>
+      </w:r>
+      <w:r>
+        <w:t xml:space="preserve">. Only four instruments have been developed specifically for healthcare, and only two have been validated</w:t>
+      </w:r>
+      <w:r>
+        <w:t xml:space="preserve"> </w:t>
+      </w:r>
+      <w:r>
+        <w:t xml:space="preserve">(</w:t>
+      </w:r>
+      <w:hyperlink w:anchor="ref-ratliff2025">
+        <w:r>
+          <w:rPr>
+            <w:rStyle w:val="Hyperlink"/>
+          </w:rPr>
+          <w:t xml:space="preserve">57</w:t>
+        </w:r>
+      </w:hyperlink>
+      <w:r>
+        <w:t xml:space="preserve">)</w:t>
+      </w:r>
+      <w:r>
+        <w:t xml:space="preserve">. The Three-Pillar Assessment addresses this gap by organizing evidence-based indicators around the specific domains where institutional amnesia operates, measuring not just where an organization stands but how vulnerable it is to the compounding effects identified in Section 1.</w:t>
       </w:r>
     </w:p>
     <w:bookmarkEnd w:id="27"/>
-    <w:bookmarkStart w:id="28" w:name="operationalizing-the-ari"/>
+    <w:bookmarkStart w:id="28" w:name="the-three-pillar-rubric"/>
     <w:p>
       <w:pPr>
         <w:pStyle w:val="Heading2"/>
@@ -3301,7 +3337,7 @@
         <w:tab/>
       </w:r>
       <w:r>
-        <w:t xml:space="preserve">Operationalizing the ARI</w:t>
+        <w:t xml:space="preserve">The Three-Pillar Rubric</w:t>
       </w:r>
     </w:p>
     <w:p>
@@ -3309,31 +3345,19 @@
         <w:pStyle w:val="FirstParagraph"/>
       </w:pPr>
       <w:r>
-        <w:t xml:space="preserve">Each ARI dimension (Table 1) can be scored on a Likert-type scale from 1 (fragile) to 5 (antifragile). For example, the</w:t>
-      </w:r>
-      <w:r>
-        <w:t xml:space="preserve"> </w:t>
-      </w:r>
-      <w:r>
-        <w:t xml:space="preserve">“Knowledge Locus”</w:t>
-      </w:r>
-      <w:r>
-        <w:t xml:space="preserve"> </w:t>
-      </w:r>
-      <w:r>
-        <w:t xml:space="preserve">dimension would be scored by surveying whether key analytical queries are documented in a shared, version-controlled repository (score 5) or known only to named individuals who could leave at any time (score 1). Similarly,</w:t>
-      </w:r>
-      <w:r>
-        <w:t xml:space="preserve"> </w:t>
-      </w:r>
-      <w:r>
-        <w:t xml:space="preserve">“Turnover Impact”</w:t>
-      </w:r>
-      <w:r>
-        <w:t xml:space="preserve"> </w:t>
-      </w:r>
-      <w:r>
-        <w:t xml:space="preserve">could be assessed through scenario exercises that simulate the departure of a critical team member and measure the time required to restore reporting capability. An aggregate ARI score across all dimensions provides a composite indicator of organizational resilience posture, enabling longitudinal tracking and cross-institutional benchmarking.</w:t>
+        <w:t xml:space="preserve">Each indicator is scored as Low, Medium, or High Strength using evidence-based anchors from the literature reviewed in Section 4. Organizations scoring predominantly</w:t>
+      </w:r>
+      <w:r>
+        <w:t xml:space="preserve"> </w:t>
+      </w:r>
+      <w:r>
+        <w:t xml:space="preserve">“Low Strength”</w:t>
+      </w:r>
+      <w:r>
+        <w:t xml:space="preserve"> </w:t>
+      </w:r>
+      <w:r>
+        <w:t xml:space="preserve">across multiple pillars face the self-reinforcing degradation cycle that the framework identifies as the central threat.</w:t>
       </w:r>
     </w:p>
     <w:p>
@@ -3341,191 +3365,11 @@
         <w:pStyle w:val="BodyText"/>
       </w:pPr>
       <w:r>
-        <w:t xml:space="preserve">The</w:t>
-      </w:r>
-      <w:r>
-        <w:t xml:space="preserve"> </w:t>
-      </w:r>
-      <w:r>
-        <w:t xml:space="preserve">“Schema Coupling”</w:t>
-      </w:r>
-      <w:r>
-        <w:t xml:space="preserve"> </w:t>
-      </w:r>
-      <w:r>
-        <w:t xml:space="preserve">dimension can be operationalized through</w:t>
-      </w:r>
-      <w:r>
-        <w:t xml:space="preserve"> </w:t>
-      </w:r>
-      <w:r>
         <w:rPr>
-          <w:i/>
-          <w:iCs/>
+          <w:b/>
+          <w:bCs/>
         </w:rPr>
-        <w:t xml:space="preserve">Continuous Analytic Integration</w:t>
-      </w:r>
-      <w:r>
-        <w:t xml:space="preserve">: treating validated query triples not as static wiki entries but as software assets within a CI/CD pipeline</w:t>
-      </w:r>
-      <w:r>
-        <w:t xml:space="preserve"> </w:t>
-      </w:r>
-      <w:r>
-        <w:t xml:space="preserve">(</w:t>
-      </w:r>
-      <w:hyperlink w:anchor="ref-valiaiev2025">
-        <w:r>
-          <w:rPr>
-            <w:rStyle w:val="Hyperlink"/>
-          </w:rPr>
-          <w:t xml:space="preserve">55</w:t>
-        </w:r>
-      </w:hyperlink>
-      <w:r>
-        <w:t xml:space="preserve">)</w:t>
-      </w:r>
-      <w:r>
-        <w:t xml:space="preserve">. When a data warehouse schema is updated (e.g., a quarterly EHR upgrade), the system automatically re-runs the library of stored queries. Queries that fail or return anomalous results are flagged for review. This transforms</w:t>
-      </w:r>
-      <w:r>
-        <w:t xml:space="preserve"> </w:t>
-      </w:r>
-      <w:r>
-        <w:t xml:space="preserve">“Institutional Memory”</w:t>
-      </w:r>
-      <w:r>
-        <w:t xml:space="preserve"> </w:t>
-      </w:r>
-      <w:r>
-        <w:t xml:space="preserve">from a stagnant repository into a living, automated test suite that actively signals when organizational knowledge has drifted from technical reality</w:t>
-      </w:r>
-      <w:r>
-        <w:t xml:space="preserve"> </w:t>
-      </w:r>
-      <w:r>
-        <w:t xml:space="preserve">(</w:t>
-      </w:r>
-      <w:hyperlink w:anchor="ref-betha2023">
-        <w:r>
-          <w:rPr>
-            <w:rStyle w:val="Hyperlink"/>
-          </w:rPr>
-          <w:t xml:space="preserve">56</w:t>
-        </w:r>
-      </w:hyperlink>
-      <w:r>
-        <w:t xml:space="preserve">)</w:t>
-      </w:r>
-      <w:r>
-        <w:t xml:space="preserve">. Existing NL2SQL systems are known to lack resilience to vocabulary drift and OMOP CDM schema changes</w:t>
-      </w:r>
-      <w:r>
-        <w:t xml:space="preserve"> </w:t>
-      </w:r>
-      <w:r>
-        <w:t xml:space="preserve">(</w:t>
-      </w:r>
-      <w:hyperlink w:anchor="ref-kottam2025">
-        <w:r>
-          <w:rPr>
-            <w:rStyle w:val="Hyperlink"/>
-          </w:rPr>
-          <w:t xml:space="preserve">57</w:t>
-        </w:r>
-      </w:hyperlink>
-      <w:r>
-        <w:t xml:space="preserve">)</w:t>
-      </w:r>
-      <w:r>
-        <w:t xml:space="preserve">, making such automated regression essential.</w:t>
-      </w:r>
-    </w:p>
-    <w:p>
-      <w:pPr>
-        <w:pStyle w:val="BodyText"/>
-      </w:pPr>
-      <w:r>
-        <w:t xml:space="preserve">A recent systematic review identified 23 distinct organizational resilience instruments applied in health facilities, yet found no consensus on what to measure or which indicators to use</w:t>
-      </w:r>
-      <w:r>
-        <w:t xml:space="preserve"> </w:t>
-      </w:r>
-      <w:r>
-        <w:t xml:space="preserve">(</w:t>
-      </w:r>
-      <w:hyperlink w:anchor="ref-ignatowicz2023">
-        <w:r>
-          <w:rPr>
-            <w:rStyle w:val="Hyperlink"/>
-          </w:rPr>
-          <w:t xml:space="preserve">58</w:t>
-        </w:r>
-      </w:hyperlink>
-      <w:r>
-        <w:t xml:space="preserve">)</w:t>
-      </w:r>
-      <w:r>
-        <w:t xml:space="preserve">. Only four instruments have been developed specifically for healthcare, and only two have been validated</w:t>
-      </w:r>
-      <w:r>
-        <w:t xml:space="preserve"> </w:t>
-      </w:r>
-      <w:r>
-        <w:t xml:space="preserve">(</w:t>
-      </w:r>
-      <w:hyperlink w:anchor="ref-ratliff2025">
-        <w:r>
-          <w:rPr>
-            <w:rStyle w:val="Hyperlink"/>
-          </w:rPr>
-          <w:t xml:space="preserve">59</w:t>
-        </w:r>
-      </w:hyperlink>
-      <w:r>
-        <w:t xml:space="preserve">)</w:t>
-      </w:r>
-      <w:r>
-        <w:t xml:space="preserve">. The newest, the Resilience in Healthcare Capacities Assessment (RHCA), demonstrates significant correlations between organizational resilience and both staff turnover intention and patient safety outcomes</w:t>
-      </w:r>
-      <w:r>
-        <w:t xml:space="preserve"> </w:t>
-      </w:r>
-      <w:r>
-        <w:t xml:space="preserve">(</w:t>
-      </w:r>
-      <w:hyperlink w:anchor="ref-ellis2026">
-        <w:r>
-          <w:rPr>
-            <w:rStyle w:val="Hyperlink"/>
-          </w:rPr>
-          <w:t xml:space="preserve">60</w:t>
-        </w:r>
-      </w:hyperlink>
-      <w:r>
-        <w:t xml:space="preserve">)</w:t>
-      </w:r>
-      <w:r>
-        <w:t xml:space="preserve">. The ARI extends this emerging measurement tradition into the specific domain of analytics capability resilience, which no existing instrument addresses. Both the ARI and the broader pillar assessment require psychometric development, including construct validation, inter-rater reliability testing, and discriminant validity assessment against AMAM, before organizational deployment. This development is planned for future work in this series.</w:t>
-      </w:r>
-    </w:p>
-    <w:p>
-      <w:pPr>
-        <w:pStyle w:val="BodyText"/>
-      </w:pPr>
-      <w:r>
-        <w:t xml:space="preserve">Critically, the ARI complements rather than replaces AMAM. Where AMAM measures the sophistication of an organization’s analytical capabilities at a point in time, the ARI measures the durability of those capabilities under workforce stress. An organization should aspire to high scores on both instruments: AMAM for capability and ARI for sustainability. Used together, they provide a two-dimensional view of analytics health that neither instrument offers alone.</w:t>
-      </w:r>
-    </w:p>
-    <w:p>
-      <w:pPr>
-        <w:pStyle w:val="TableCaption"/>
-      </w:pPr>
-      <w:r>
-        <w:t xml:space="preserve">The Analytics Resilience Index (ARI).</w:t>
-      </w:r>
-      <w:r>
-        <w:t xml:space="preserve"> </w:t>
+        <w:t xml:space="preserve">Pillar 1: Analytics Maturity</w:t>
       </w:r>
     </w:p>
     <w:tbl>
@@ -3534,13 +3378,13 @@
         <w:tblW w:type="pct" w:w="5000"/>
         <w:tblLayout w:type="fixed"/>
         <w:tblLook w:firstRow="1" w:lastRow="0" w:firstColumn="0" w:lastColumn="0" w:noHBand="0" w:noVBand="0" w:val="0020"/>
-        <w:tblCaption w:val="The Analytics Resilience Index (ARI). "/>
       </w:tblPr>
       <w:tblGrid>
-        <w:gridCol w:w="1980"/>
-        <w:gridCol w:w="1980"/>
-        <w:gridCol w:w="1980"/>
-        <w:gridCol w:w="1980"/>
+        <w:gridCol w:w="1584"/>
+        <w:gridCol w:w="1584"/>
+        <w:gridCol w:w="1584"/>
+        <w:gridCol w:w="1584"/>
+        <w:gridCol w:w="1584"/>
       </w:tblGrid>
       <w:tr>
         <w:trPr>
@@ -3554,7 +3398,7 @@
               <w:jc w:val="left"/>
             </w:pPr>
             <w:r>
-              <w:t xml:space="preserve">Dimension</w:t>
+              <w:t xml:space="preserve">Indicator</w:t>
             </w:r>
           </w:p>
         </w:tc>
@@ -3566,7 +3410,7 @@
               <w:jc w:val="left"/>
             </w:pPr>
             <w:r>
-              <w:t xml:space="preserve">Low Resilience (Fragile)</w:t>
+              <w:t xml:space="preserve">Low Strength</w:t>
             </w:r>
           </w:p>
         </w:tc>
@@ -3578,7 +3422,19 @@
               <w:jc w:val="left"/>
             </w:pPr>
             <w:r>
-              <w:t xml:space="preserve">High Resilience (Antifragile)</w:t>
+              <w:t xml:space="preserve">Med. Strength</w:t>
+            </w:r>
+          </w:p>
+        </w:tc>
+        <w:tc>
+          <w:tcPr/>
+          <w:p>
+            <w:pPr>
+              <w:pStyle w:val="Compact"/>
+              <w:jc w:val="left"/>
+            </w:pPr>
+            <w:r>
+              <w:t xml:space="preserve">High Strength</w:t>
             </w:r>
           </w:p>
         </w:tc>
@@ -3604,11 +3460,7 @@
               <w:jc w:val="left"/>
             </w:pPr>
             <w:r>
-              <w:rPr>
-                <w:b/>
-                <w:bCs/>
-              </w:rPr>
-              <w:t xml:space="preserve">Knowledge Locus</w:t>
+              <w:t xml:space="preserve">HIMSS AMAM Stage</w:t>
             </w:r>
           </w:p>
         </w:tc>
@@ -3620,19 +3472,7 @@
               <w:jc w:val="left"/>
             </w:pPr>
             <w:r>
-              <w:t xml:space="preserve">Knowledge resides in</w:t>
-            </w:r>
-            <w:r>
-              <w:t xml:space="preserve"> </w:t>
-            </w:r>
-            <w:r>
-              <w:t xml:space="preserve">“Hero”</w:t>
-            </w:r>
-            <w:r>
-              <w:t xml:space="preserve"> </w:t>
-            </w:r>
-            <w:r>
-              <w:t xml:space="preserve">analysts.</w:t>
+              <w:t xml:space="preserve">Stages 0-2: Fragmented data, limited reporting</w:t>
             </w:r>
           </w:p>
         </w:tc>
@@ -3644,7 +3484,19 @@
               <w:jc w:val="left"/>
             </w:pPr>
             <w:r>
-              <w:t xml:space="preserve">Knowledge resides in the System/Repository.</w:t>
+              <w:t xml:space="preserve">Stages 3-4: Integrated warehouse, standardized definitions</w:t>
+            </w:r>
+          </w:p>
+        </w:tc>
+        <w:tc>
+          <w:tcPr/>
+          <w:p>
+            <w:pPr>
+              <w:pStyle w:val="Compact"/>
+              <w:jc w:val="left"/>
+            </w:pPr>
+            <w:r>
+              <w:t xml:space="preserve">Stages 5-7: Predictive analytics, AI integration</w:t>
             </w:r>
           </w:p>
         </w:tc>
@@ -3658,23 +3510,23 @@
             <w:r>
               <w:t xml:space="preserve">(</w:t>
             </w:r>
-            <w:hyperlink w:anchor="ref-hong2025">
+            <w:hyperlink w:anchor="ref-himss2024">
               <w:r>
                 <w:rPr>
                   <w:rStyle w:val="Hyperlink"/>
                 </w:rPr>
-                <w:t xml:space="preserve">4</w:t>
+                <w:t xml:space="preserve">1</w:t>
               </w:r>
             </w:hyperlink>
             <w:r>
               <w:t xml:space="preserve">,</w:t>
             </w:r>
-            <w:hyperlink w:anchor="ref-benbya2004">
+            <w:hyperlink w:anchor="ref-himss2024news">
               <w:r>
                 <w:rPr>
                   <w:rStyle w:val="Hyperlink"/>
                 </w:rPr>
-                <w:t xml:space="preserve">31</w:t>
+                <w:t xml:space="preserve">36</w:t>
               </w:r>
             </w:hyperlink>
             <w:r>
@@ -3692,11 +3544,7 @@
               <w:jc w:val="left"/>
             </w:pPr>
             <w:r>
-              <w:rPr>
-                <w:b/>
-                <w:bCs/>
-              </w:rPr>
-              <w:t xml:space="preserve">Turnover Impact</w:t>
+              <w:t xml:space="preserve">Self-service analytics</w:t>
             </w:r>
           </w:p>
         </w:tc>
@@ -3708,7 +3556,7 @@
               <w:jc w:val="left"/>
             </w:pPr>
             <w:r>
-              <w:t xml:space="preserve">Departure of 1 staff member stops reporting.</w:t>
+              <w:t xml:space="preserve">None; all analytics require IT intervention</w:t>
             </w:r>
           </w:p>
         </w:tc>
@@ -3720,7 +3568,19 @@
               <w:jc w:val="left"/>
             </w:pPr>
             <w:r>
-              <w:t xml:space="preserve">Departure causes minimal disruption; successors inherit queries.</w:t>
+              <w:t xml:space="preserve">Partial; BI tools available but underutilized</w:t>
+            </w:r>
+          </w:p>
+        </w:tc>
+        <w:tc>
+          <w:tcPr/>
+          <w:p>
+            <w:pPr>
+              <w:pStyle w:val="Compact"/>
+              <w:jc w:val="left"/>
+            </w:pPr>
+            <w:r>
+              <w:t xml:space="preserve">Widespread; clinical staff access data directly</w:t>
             </w:r>
           </w:p>
         </w:tc>
@@ -3734,23 +3594,23 @@
             <w:r>
               <w:t xml:space="preserve">(</w:t>
             </w:r>
-            <w:hyperlink w:anchor="ref-rao2006">
+            <w:hyperlink w:anchor="ref-health2020">
               <w:r>
                 <w:rPr>
                   <w:rStyle w:val="Hyperlink"/>
                 </w:rPr>
-                <w:t xml:space="preserve">11</w:t>
+                <w:t xml:space="preserve">37</w:t>
               </w:r>
             </w:hyperlink>
             <w:r>
               <w:t xml:space="preserve">,</w:t>
             </w:r>
-            <w:hyperlink w:anchor="ref-massingham2018">
+            <w:hyperlink w:anchor="ref-shahbaz2019">
               <w:r>
                 <w:rPr>
                   <w:rStyle w:val="Hyperlink"/>
                 </w:rPr>
-                <w:t xml:space="preserve">23</w:t>
+                <w:t xml:space="preserve">42</w:t>
               </w:r>
             </w:hyperlink>
             <w:r>
@@ -3768,11 +3628,7 @@
               <w:jc w:val="left"/>
             </w:pPr>
             <w:r>
-              <w:rPr>
-                <w:b/>
-                <w:bCs/>
-              </w:rPr>
-              <w:t xml:space="preserve">Validation Mode</w:t>
+              <w:t xml:space="preserve">AI/NL interface</w:t>
             </w:r>
           </w:p>
         </w:tc>
@@ -3784,7 +3640,7 @@
               <w:jc w:val="left"/>
             </w:pPr>
             <w:r>
-              <w:t xml:space="preserve">Ad-hoc, email-based, ephemeral.</w:t>
+              <w:t xml:space="preserve">No NL2SQL or conversational analytics</w:t>
             </w:r>
           </w:p>
         </w:tc>
@@ -3796,7 +3652,19 @@
               <w:jc w:val="left"/>
             </w:pPr>
             <w:r>
-              <w:t xml:space="preserve">Systematic, artifact-based, durable (HiL-SG).</w:t>
+              <w:t xml:space="preserve">Pilot programs or evaluation underway</w:t>
+            </w:r>
+          </w:p>
+        </w:tc>
+        <w:tc>
+          <w:tcPr/>
+          <w:p>
+            <w:pPr>
+              <w:pStyle w:val="Compact"/>
+              <w:jc w:val="left"/>
+            </w:pPr>
+            <w:r>
+              <w:t xml:space="preserve">Natural language query capability deployed</w:t>
             </w:r>
           </w:p>
         </w:tc>
@@ -3810,23 +3678,199 @@
             <w:r>
               <w:t xml:space="preserve">(</w:t>
             </w:r>
-            <w:hyperlink w:anchor="ref-moore2018">
+            <w:hyperlink w:anchor="ref-ziletti2024">
               <w:r>
                 <w:rPr>
                   <w:rStyle w:val="Hyperlink"/>
                 </w:rPr>
-                <w:t xml:space="preserve">26</w:t>
+                <w:t xml:space="preserve">29</w:t>
               </w:r>
             </w:hyperlink>
             <w:r>
               <w:t xml:space="preserve">,</w:t>
             </w:r>
-            <w:hyperlink w:anchor="ref-mosqueirarey2023">
+            <w:hyperlink w:anchor="ref-yuan2019">
               <w:r>
                 <w:rPr>
                   <w:rStyle w:val="Hyperlink"/>
                 </w:rPr>
-                <w:t xml:space="preserve">30</w:t>
+                <w:t xml:space="preserve">50</w:t>
+              </w:r>
+            </w:hyperlink>
+            <w:r>
+              <w:t xml:space="preserve">)</w:t>
+            </w:r>
+          </w:p>
+        </w:tc>
+      </w:tr>
+    </w:tbl>
+    <w:p>
+      <w:pPr>
+        <w:pStyle w:val="BodyText"/>
+      </w:pPr>
+      <w:r>
+        <w:rPr>
+          <w:b/>
+          <w:bCs/>
+        </w:rPr>
+        <w:t xml:space="preserve">Pillar 2: Workforce Agility</w:t>
+      </w:r>
+    </w:p>
+    <w:tbl>
+      <w:tblPr>
+        <w:tblStyle w:val="Table"/>
+        <w:tblW w:type="pct" w:w="5000"/>
+        <w:tblLayout w:type="fixed"/>
+        <w:tblLook w:firstRow="1" w:lastRow="0" w:firstColumn="0" w:lastColumn="0" w:noHBand="0" w:noVBand="0" w:val="0020"/>
+      </w:tblPr>
+      <w:tblGrid>
+        <w:gridCol w:w="1584"/>
+        <w:gridCol w:w="1584"/>
+        <w:gridCol w:w="1584"/>
+        <w:gridCol w:w="1584"/>
+        <w:gridCol w:w="1584"/>
+      </w:tblGrid>
+      <w:tr>
+        <w:trPr>
+          <w:tblHeader w:val="on"/>
+        </w:trPr>
+        <w:tc>
+          <w:tcPr/>
+          <w:p>
+            <w:pPr>
+              <w:pStyle w:val="Compact"/>
+              <w:jc w:val="left"/>
+            </w:pPr>
+            <w:r>
+              <w:t xml:space="preserve">Indicator</w:t>
+            </w:r>
+          </w:p>
+        </w:tc>
+        <w:tc>
+          <w:tcPr/>
+          <w:p>
+            <w:pPr>
+              <w:pStyle w:val="Compact"/>
+              <w:jc w:val="left"/>
+            </w:pPr>
+            <w:r>
+              <w:t xml:space="preserve">Low Strength</w:t>
+            </w:r>
+          </w:p>
+        </w:tc>
+        <w:tc>
+          <w:tcPr/>
+          <w:p>
+            <w:pPr>
+              <w:pStyle w:val="Compact"/>
+              <w:jc w:val="left"/>
+            </w:pPr>
+            <w:r>
+              <w:t xml:space="preserve">Med. Strength</w:t>
+            </w:r>
+          </w:p>
+        </w:tc>
+        <w:tc>
+          <w:tcPr/>
+          <w:p>
+            <w:pPr>
+              <w:pStyle w:val="Compact"/>
+              <w:jc w:val="left"/>
+            </w:pPr>
+            <w:r>
+              <w:t xml:space="preserve">High Strength</w:t>
+            </w:r>
+          </w:p>
+        </w:tc>
+        <w:tc>
+          <w:tcPr/>
+          <w:p>
+            <w:pPr>
+              <w:pStyle w:val="Compact"/>
+              <w:jc w:val="left"/>
+            </w:pPr>
+            <w:r>
+              <w:t xml:space="preserve">Evidence</w:t>
+            </w:r>
+          </w:p>
+        </w:tc>
+      </w:tr>
+      <w:tr>
+        <w:tc>
+          <w:tcPr/>
+          <w:p>
+            <w:pPr>
+              <w:pStyle w:val="Compact"/>
+              <w:jc w:val="left"/>
+            </w:pPr>
+            <w:r>
+              <w:t xml:space="preserve">First-year analytics staff turnover</w:t>
+            </w:r>
+          </w:p>
+        </w:tc>
+        <w:tc>
+          <w:tcPr/>
+          <w:p>
+            <w:pPr>
+              <w:pStyle w:val="Compact"/>
+              <w:jc w:val="left"/>
+            </w:pPr>
+            <w:r>
+              <w:t xml:space="preserve">&gt;30% (High instability)</w:t>
+            </w:r>
+          </w:p>
+        </w:tc>
+        <w:tc>
+          <w:tcPr/>
+          <w:p>
+            <w:pPr>
+              <w:pStyle w:val="Compact"/>
+              <w:jc w:val="left"/>
+            </w:pPr>
+            <w:r>
+              <w:t xml:space="preserve">15-30%</w:t>
+            </w:r>
+          </w:p>
+        </w:tc>
+        <w:tc>
+          <w:tcPr/>
+          <w:p>
+            <w:pPr>
+              <w:pStyle w:val="Compact"/>
+              <w:jc w:val="left"/>
+            </w:pPr>
+            <w:r>
+              <w:t xml:space="preserve">&lt;15% (High stability)</w:t>
+            </w:r>
+          </w:p>
+        </w:tc>
+        <w:tc>
+          <w:tcPr/>
+          <w:p>
+            <w:pPr>
+              <w:pStyle w:val="Compact"/>
+              <w:jc w:val="left"/>
+            </w:pPr>
+            <w:r>
+              <w:t xml:space="preserve">(</w:t>
+            </w:r>
+            <w:hyperlink w:anchor="ref-nsi2025">
+              <w:r>
+                <w:rPr>
+                  <w:rStyle w:val="Hyperlink"/>
+                </w:rPr>
+                <w:t xml:space="preserve">19</w:t>
+              </w:r>
+            </w:hyperlink>
+            <w:r>
+              <w:t xml:space="preserve">,</w:t>
+            </w:r>
+            <w:hyperlink w:anchor="ref-hackney2024">
+              <w:r>
+                <w:rPr>
+                  <w:rStyle w:val="Hyperlink"/>
+                </w:rPr>
+                <w:t xml:space="preserve">45</w:t>
               </w:r>
             </w:hyperlink>
             <w:r>
@@ -3844,11 +3888,7 @@
               <w:jc w:val="left"/>
             </w:pPr>
             <w:r>
-              <w:rPr>
-                <w:b/>
-                <w:bCs/>
-              </w:rPr>
-              <w:t xml:space="preserve">Schema Coupling</w:t>
+              <w:t xml:space="preserve">Avg. leadership tenure</w:t>
             </w:r>
           </w:p>
         </w:tc>
@@ -3860,7 +3900,7 @@
               <w:jc w:val="left"/>
             </w:pPr>
             <w:r>
-              <w:t xml:space="preserve">Hard-coded reports break on schema change.</w:t>
+              <w:t xml:space="preserve">&lt; 3 years</w:t>
             </w:r>
           </w:p>
         </w:tc>
@@ -3872,7 +3912,448 @@
               <w:jc w:val="left"/>
             </w:pPr>
             <w:r>
-              <w:t xml:space="preserve">Semantic layer adapts; CI/CD detects drift.</w:t>
+              <w:t xml:space="preserve">3-5 years</w:t>
+            </w:r>
+          </w:p>
+        </w:tc>
+        <w:tc>
+          <w:tcPr/>
+          <w:p>
+            <w:pPr>
+              <w:pStyle w:val="Compact"/>
+              <w:jc w:val="left"/>
+            </w:pPr>
+            <w:r>
+              <w:t xml:space="preserve">&gt; 5 years</w:t>
+            </w:r>
+          </w:p>
+        </w:tc>
+        <w:tc>
+          <w:tcPr/>
+          <w:p>
+            <w:pPr>
+              <w:pStyle w:val="Compact"/>
+              <w:jc w:val="left"/>
+            </w:pPr>
+            <w:r>
+              <w:t xml:space="preserve">(</w:t>
+            </w:r>
+            <w:hyperlink w:anchor="ref-wittkieffer2024">
+              <w:r>
+                <w:rPr>
+                  <w:rStyle w:val="Hyperlink"/>
+                </w:rPr>
+                <w:t xml:space="preserve">5</w:t>
+              </w:r>
+            </w:hyperlink>
+            <w:r>
+              <w:t xml:space="preserve">)</w:t>
+            </w:r>
+          </w:p>
+        </w:tc>
+      </w:tr>
+      <w:tr>
+        <w:tc>
+          <w:tcPr/>
+          <w:p>
+            <w:pPr>
+              <w:pStyle w:val="Compact"/>
+              <w:jc w:val="left"/>
+            </w:pPr>
+            <w:r>
+              <w:t xml:space="preserve">Knowledge concentration</w:t>
+            </w:r>
+          </w:p>
+        </w:tc>
+        <w:tc>
+          <w:tcPr/>
+          <w:p>
+            <w:pPr>
+              <w:pStyle w:val="Compact"/>
+              <w:jc w:val="left"/>
+            </w:pPr>
+            <w:r>
+              <w:t xml:space="preserve">Critical expertise held by 3 or fewer individuals</w:t>
+            </w:r>
+          </w:p>
+        </w:tc>
+        <w:tc>
+          <w:tcPr/>
+          <w:p>
+            <w:pPr>
+              <w:pStyle w:val="Compact"/>
+              <w:jc w:val="left"/>
+            </w:pPr>
+            <w:r>
+              <w:t xml:space="preserve">Partial documentation; some cross-training</w:t>
+            </w:r>
+          </w:p>
+        </w:tc>
+        <w:tc>
+          <w:tcPr/>
+          <w:p>
+            <w:pPr>
+              <w:pStyle w:val="Compact"/>
+              <w:jc w:val="left"/>
+            </w:pPr>
+            <w:r>
+              <w:t xml:space="preserve">Distributed expertise; documented processes</w:t>
+            </w:r>
+          </w:p>
+        </w:tc>
+        <w:tc>
+          <w:tcPr/>
+          <w:p>
+            <w:pPr>
+              <w:pStyle w:val="Compact"/>
+              <w:jc w:val="left"/>
+            </w:pPr>
+            <w:r>
+              <w:t xml:space="preserve">(</w:t>
+            </w:r>
+            <w:hyperlink w:anchor="ref-massingham2018">
+              <w:r>
+                <w:rPr>
+                  <w:rStyle w:val="Hyperlink"/>
+                </w:rPr>
+                <w:t xml:space="preserve">23</w:t>
+              </w:r>
+            </w:hyperlink>
+            <w:r>
+              <w:t xml:space="preserve">,</w:t>
+            </w:r>
+            <w:hyperlink w:anchor="ref-foss2007">
+              <w:r>
+                <w:rPr>
+                  <w:rStyle w:val="Hyperlink"/>
+                </w:rPr>
+                <w:t xml:space="preserve">27</w:t>
+              </w:r>
+            </w:hyperlink>
+            <w:r>
+              <w:t xml:space="preserve">)</w:t>
+            </w:r>
+          </w:p>
+        </w:tc>
+      </w:tr>
+    </w:tbl>
+    <w:p>
+      <w:pPr>
+        <w:pStyle w:val="BodyText"/>
+      </w:pPr>
+      <w:r>
+        <w:rPr>
+          <w:b/>
+          <w:bCs/>
+        </w:rPr>
+        <w:t xml:space="preserve">Pillar 3: Technical Enablement</w:t>
+      </w:r>
+    </w:p>
+    <w:p>
+      <w:pPr>
+        <w:pStyle w:val="TableCaption"/>
+      </w:pPr>
+      <w:r>
+        <w:t xml:space="preserve">Three-Pillar Organizational Assessment Rubric.</w:t>
+      </w:r>
+      <w:r>
+        <w:t xml:space="preserve"> </w:t>
+      </w:r>
+    </w:p>
+    <w:tbl>
+      <w:tblPr>
+        <w:tblStyle w:val="Table"/>
+        <w:tblW w:type="pct" w:w="5000"/>
+        <w:tblLayout w:type="fixed"/>
+        <w:tblLook w:firstRow="1" w:lastRow="0" w:firstColumn="0" w:lastColumn="0" w:noHBand="0" w:noVBand="0" w:val="0020"/>
+        <w:tblCaption w:val="Three-Pillar Organizational Assessment Rubric. "/>
+      </w:tblPr>
+      <w:tblGrid>
+        <w:gridCol w:w="1584"/>
+        <w:gridCol w:w="1584"/>
+        <w:gridCol w:w="1584"/>
+        <w:gridCol w:w="1584"/>
+        <w:gridCol w:w="1584"/>
+      </w:tblGrid>
+      <w:tr>
+        <w:trPr>
+          <w:tblHeader w:val="on"/>
+        </w:trPr>
+        <w:tc>
+          <w:tcPr/>
+          <w:p>
+            <w:pPr>
+              <w:pStyle w:val="Compact"/>
+              <w:jc w:val="left"/>
+            </w:pPr>
+            <w:r>
+              <w:t xml:space="preserve">Indicator</w:t>
+            </w:r>
+          </w:p>
+        </w:tc>
+        <w:tc>
+          <w:tcPr/>
+          <w:p>
+            <w:pPr>
+              <w:pStyle w:val="Compact"/>
+              <w:jc w:val="left"/>
+            </w:pPr>
+            <w:r>
+              <w:t xml:space="preserve">Low Strength</w:t>
+            </w:r>
+          </w:p>
+        </w:tc>
+        <w:tc>
+          <w:tcPr/>
+          <w:p>
+            <w:pPr>
+              <w:pStyle w:val="Compact"/>
+              <w:jc w:val="left"/>
+            </w:pPr>
+            <w:r>
+              <w:t xml:space="preserve">Med. Strength</w:t>
+            </w:r>
+          </w:p>
+        </w:tc>
+        <w:tc>
+          <w:tcPr/>
+          <w:p>
+            <w:pPr>
+              <w:pStyle w:val="Compact"/>
+              <w:jc w:val="left"/>
+            </w:pPr>
+            <w:r>
+              <w:t xml:space="preserve">High Strength</w:t>
+            </w:r>
+          </w:p>
+        </w:tc>
+        <w:tc>
+          <w:tcPr/>
+          <w:p>
+            <w:pPr>
+              <w:pStyle w:val="Compact"/>
+              <w:jc w:val="left"/>
+            </w:pPr>
+            <w:r>
+              <w:t xml:space="preserve">Evidence</w:t>
+            </w:r>
+          </w:p>
+        </w:tc>
+      </w:tr>
+      <w:tr>
+        <w:tc>
+          <w:tcPr/>
+          <w:p>
+            <w:pPr>
+              <w:pStyle w:val="Compact"/>
+              <w:jc w:val="left"/>
+            </w:pPr>
+            <w:r>
+              <w:t xml:space="preserve">Data access</w:t>
+            </w:r>
+          </w:p>
+        </w:tc>
+        <w:tc>
+          <w:tcPr/>
+          <w:p>
+            <w:pPr>
+              <w:pStyle w:val="Compact"/>
+              <w:jc w:val="left"/>
+            </w:pPr>
+            <w:r>
+              <w:t xml:space="preserve">SQL/technical expertise required for all queries</w:t>
+            </w:r>
+          </w:p>
+        </w:tc>
+        <w:tc>
+          <w:tcPr/>
+          <w:p>
+            <w:pPr>
+              <w:pStyle w:val="Compact"/>
+              <w:jc w:val="left"/>
+            </w:pPr>
+            <w:r>
+              <w:t xml:space="preserve">IT queue for complex queries; basic self-service</w:t>
+            </w:r>
+          </w:p>
+        </w:tc>
+        <w:tc>
+          <w:tcPr/>
+          <w:p>
+            <w:pPr>
+              <w:pStyle w:val="Compact"/>
+              <w:jc w:val="left"/>
+            </w:pPr>
+            <w:r>
+              <w:t xml:space="preserve">Natural language or visual query interfaces</w:t>
+            </w:r>
+          </w:p>
+        </w:tc>
+        <w:tc>
+          <w:tcPr/>
+          <w:p>
+            <w:pPr>
+              <w:pStyle w:val="Compact"/>
+              <w:jc w:val="left"/>
+            </w:pPr>
+            <w:r>
+              <w:t xml:space="preserve">(</w:t>
+            </w:r>
+            <w:hyperlink w:anchor="ref-shahbaz2019">
+              <w:r>
+                <w:rPr>
+                  <w:rStyle w:val="Hyperlink"/>
+                </w:rPr>
+                <w:t xml:space="preserve">42</w:t>
+              </w:r>
+            </w:hyperlink>
+            <w:r>
+              <w:t xml:space="preserve">,</w:t>
+            </w:r>
+            <w:hyperlink w:anchor="ref-yuan2019">
+              <w:r>
+                <w:rPr>
+                  <w:rStyle w:val="Hyperlink"/>
+                </w:rPr>
+                <w:t xml:space="preserve">50</w:t>
+              </w:r>
+            </w:hyperlink>
+            <w:r>
+              <w:t xml:space="preserve">)</w:t>
+            </w:r>
+          </w:p>
+        </w:tc>
+      </w:tr>
+      <w:tr>
+        <w:tc>
+          <w:tcPr/>
+          <w:p>
+            <w:pPr>
+              <w:pStyle w:val="Compact"/>
+              <w:jc w:val="left"/>
+            </w:pPr>
+            <w:r>
+              <w:t xml:space="preserve">Interoperability</w:t>
+            </w:r>
+          </w:p>
+        </w:tc>
+        <w:tc>
+          <w:tcPr/>
+          <w:p>
+            <w:pPr>
+              <w:pStyle w:val="Compact"/>
+              <w:jc w:val="left"/>
+            </w:pPr>
+            <w:r>
+              <w:t xml:space="preserve">Fragmented systems; manual reconciliation</w:t>
+            </w:r>
+          </w:p>
+        </w:tc>
+        <w:tc>
+          <w:tcPr/>
+          <w:p>
+            <w:pPr>
+              <w:pStyle w:val="Compact"/>
+              <w:jc w:val="left"/>
+            </w:pPr>
+            <w:r>
+              <w:t xml:space="preserve">Partial integration; some automated feeds</w:t>
+            </w:r>
+          </w:p>
+        </w:tc>
+        <w:tc>
+          <w:tcPr/>
+          <w:p>
+            <w:pPr>
+              <w:pStyle w:val="Compact"/>
+              <w:jc w:val="left"/>
+            </w:pPr>
+            <w:r>
+              <w:t xml:space="preserve">Unified data platform; real-time integration</w:t>
+            </w:r>
+          </w:p>
+        </w:tc>
+        <w:tc>
+          <w:tcPr/>
+          <w:p>
+            <w:pPr>
+              <w:pStyle w:val="Compact"/>
+              <w:jc w:val="left"/>
+            </w:pPr>
+            <w:r>
+              <w:t xml:space="preserve">(</w:t>
+            </w:r>
+            <w:hyperlink w:anchor="ref-gal2019">
+              <w:r>
+                <w:rPr>
+                  <w:rStyle w:val="Hyperlink"/>
+                </w:rPr>
+                <w:t xml:space="preserve">2</w:t>
+              </w:r>
+            </w:hyperlink>
+            <w:r>
+              <w:t xml:space="preserve">,</w:t>
+            </w:r>
+            <w:hyperlink w:anchor="ref-zhang2024">
+              <w:r>
+                <w:rPr>
+                  <w:rStyle w:val="Hyperlink"/>
+                </w:rPr>
+                <w:t xml:space="preserve">3</w:t>
+              </w:r>
+            </w:hyperlink>
+            <w:r>
+              <w:t xml:space="preserve">)</w:t>
+            </w:r>
+          </w:p>
+        </w:tc>
+      </w:tr>
+      <w:tr>
+        <w:tc>
+          <w:tcPr/>
+          <w:p>
+            <w:pPr>
+              <w:pStyle w:val="Compact"/>
+              <w:jc w:val="left"/>
+            </w:pPr>
+            <w:r>
+              <w:t xml:space="preserve">Schema coupling</w:t>
+            </w:r>
+          </w:p>
+        </w:tc>
+        <w:tc>
+          <w:tcPr/>
+          <w:p>
+            <w:pPr>
+              <w:pStyle w:val="Compact"/>
+              <w:jc w:val="left"/>
+            </w:pPr>
+            <w:r>
+              <w:t xml:space="preserve">Hard-coded reports break on schema change</w:t>
+            </w:r>
+          </w:p>
+        </w:tc>
+        <w:tc>
+          <w:tcPr/>
+          <w:p>
+            <w:pPr>
+              <w:pStyle w:val="Compact"/>
+              <w:jc w:val="left"/>
+            </w:pPr>
+            <w:r>
+              <w:t xml:space="preserve">Partial semantic layer; some automated feeds</w:t>
+            </w:r>
+          </w:p>
+        </w:tc>
+        <w:tc>
+          <w:tcPr/>
+          <w:p>
+            <w:pPr>
+              <w:pStyle w:val="Compact"/>
+              <w:jc w:val="left"/>
+            </w:pPr>
+            <w:r>
+              <w:t xml:space="preserve">Semantic layer adapts; CI/CD detects drift</w:t>
             </w:r>
           </w:p>
         </w:tc>
@@ -3891,7 +4372,7 @@
                 <w:rPr>
                   <w:rStyle w:val="Hyperlink"/>
                 </w:rPr>
-                <w:t xml:space="preserve">33</w:t>
+                <w:t xml:space="preserve">34</w:t>
               </w:r>
             </w:hyperlink>
             <w:r>
@@ -3902,7 +4383,7 @@
                 <w:rPr>
                   <w:rStyle w:val="Hyperlink"/>
                 </w:rPr>
-                <w:t xml:space="preserve">34</w:t>
+                <w:t xml:space="preserve">35</w:t>
               </w:r>
             </w:hyperlink>
             <w:r>
@@ -3912,6 +4393,98 @@
         </w:tc>
       </w:tr>
     </w:tbl>
+    <w:p>
+      <w:pPr>
+        <w:pStyle w:val="BodyText"/>
+      </w:pPr>
+      <w:r>
+        <w:t xml:space="preserve">The</w:t>
+      </w:r>
+      <w:r>
+        <w:t xml:space="preserve"> </w:t>
+      </w:r>
+      <w:r>
+        <w:t xml:space="preserve">“Schema Coupling”</w:t>
+      </w:r>
+      <w:r>
+        <w:t xml:space="preserve"> </w:t>
+      </w:r>
+      <w:r>
+        <w:t xml:space="preserve">indicator can be operationalized through</w:t>
+      </w:r>
+      <w:r>
+        <w:t xml:space="preserve"> </w:t>
+      </w:r>
+      <w:r>
+        <w:rPr>
+          <w:i/>
+          <w:iCs/>
+        </w:rPr>
+        <w:t xml:space="preserve">Continuous Analytic Integration</w:t>
+      </w:r>
+      <w:r>
+        <w:t xml:space="preserve">: treating validated query triples as software assets within a CI/CD pipeline</w:t>
+      </w:r>
+      <w:r>
+        <w:t xml:space="preserve"> </w:t>
+      </w:r>
+      <w:r>
+        <w:t xml:space="preserve">(</w:t>
+      </w:r>
+      <w:hyperlink w:anchor="ref-valiaiev2025">
+        <w:r>
+          <w:rPr>
+            <w:rStyle w:val="Hyperlink"/>
+          </w:rPr>
+          <w:t xml:space="preserve">58</w:t>
+        </w:r>
+      </w:hyperlink>
+      <w:r>
+        <w:t xml:space="preserve">)</w:t>
+      </w:r>
+      <w:r>
+        <w:t xml:space="preserve">. When a data warehouse schema is updated, the system automatically re-runs stored queries and flags failures, transforming institutional memory into a living test suite</w:t>
+      </w:r>
+      <w:r>
+        <w:t xml:space="preserve"> </w:t>
+      </w:r>
+      <w:r>
+        <w:t xml:space="preserve">(</w:t>
+      </w:r>
+      <w:hyperlink w:anchor="ref-betha2023">
+        <w:r>
+          <w:rPr>
+            <w:rStyle w:val="Hyperlink"/>
+          </w:rPr>
+          <w:t xml:space="preserve">59</w:t>
+        </w:r>
+      </w:hyperlink>
+      <w:r>
+        <w:t xml:space="preserve">,</w:t>
+      </w:r>
+      <w:hyperlink w:anchor="ref-kottam2025">
+        <w:r>
+          <w:rPr>
+            <w:rStyle w:val="Hyperlink"/>
+          </w:rPr>
+          <w:t xml:space="preserve">60</w:t>
+        </w:r>
+      </w:hyperlink>
+      <w:r>
+        <w:t xml:space="preserve">)</w:t>
+      </w:r>
+      <w:r>
+        <w:t xml:space="preserve">.</w:t>
+      </w:r>
+    </w:p>
+    <w:p>
+      <w:pPr>
+        <w:pStyle w:val="BodyText"/>
+      </w:pPr>
+      <w:r>
+        <w:t xml:space="preserve">The rubric complements rather than replaces AMAM. Where AMAM measures the sophistication of analytical capabilities at a point in time, the Three-Pillar Assessment reveals how vulnerable those capabilities are to the compounding effects of turnover, low maturity, and technical barriers. Used together, they provide a two-dimensional view of analytics health.</w:t>
+      </w:r>
+    </w:p>
     <w:bookmarkEnd w:id="28"/>
     <w:bookmarkEnd w:id="29"/>
     <w:bookmarkStart w:id="30" w:name="the-validator-paradox-and-standard-work"/>
@@ -3937,7 +4510,7 @@
         <w:pStyle w:val="FirstParagraph"/>
       </w:pPr>
       <w:r>
-        <w:t xml:space="preserve">A critical objection to HiL-SG is circular: if the framework requires domain experts to validate AI-generated queries, and the core problem is that domain experts are leaving, then the framework fails precisely when it is most needed. This</w:t>
+        <w:t xml:space="preserve">A critical objection to HITL-KG is circular: if the framework requires domain experts to validate AI-generated queries, and the core problem is that domain experts are leaving, then the framework fails precisely when it is most needed. This</w:t>
       </w:r>
       <w:r>
         <w:t xml:space="preserve"> </w:t>
@@ -4117,7 +4690,7 @@
         <w:t xml:space="preserve">)</w:t>
       </w:r>
       <w:r>
-        <w:t xml:space="preserve">. Those codified standards survived staff turnover precisely because they existed as organizational artifacts rather than as knowledge held solely by the individuals who created them. The HiL-SG validated query library serves an analogous function: it encodes analytical decisions into durable, retrievable structures that persist independent of any single analyst’s tenure.</w:t>
+        <w:t xml:space="preserve">. Those codified standards survived staff turnover precisely because they existed as organizational artifacts rather than as knowledge held solely by the individuals who created them. The HITL-KG validated query library serves an analogous function: it encodes analytical decisions into durable, retrievable structures that persist independent of any single analyst’s tenure.</w:t>
       </w:r>
     </w:p>
     <w:p>
@@ -4125,7 +4698,7 @@
         <w:pStyle w:val="BodyText"/>
       </w:pPr>
       <w:r>
-        <w:t xml:space="preserve">However, the Validator Paradox is not fully resolved. There exists a minimum viable expertise threshold below which validation becomes meaningless. A junior analyst rubber-stamping AI-generated output without genuine comprehension provides no knowledge ratchet; the validation artifact exists, but its epistemic value is nil. Identifying this threshold remains an open empirical question; future work in this series (Paper 2) should measure it via controlled hallucination injection studies, in which AI-generated queries containing deliberate errors are presented to validators of varying experience levels.</w:t>
+        <w:t xml:space="preserve">However, the Validator Paradox is not fully resolved. There exists a minimum viable expertise threshold below which validation becomes meaningless. A junior analyst rubber-stamping AI-generated output without genuine comprehension provides no knowledge ratchet; the validation artifact exists, but its epistemic value is nil. Identifying this threshold remains an open empirical question; future work should measure it via controlled hallucination injection studies, in which AI-generated queries containing deliberate errors are presented to validators of varying experience levels.</w:t>
       </w:r>
     </w:p>
     <w:p>
@@ -4212,7 +4785,7 @@
           <w:i/>
           <w:iCs/>
         </w:rPr>
-        <w:t xml:space="preserve">Automated regression</w:t>
+        <w:t xml:space="preserve">Automated matching</w:t>
       </w:r>
       <w:r>
         <w:t xml:space="preserve">: for queries that match an existing validated triple with high semantic similarity, the system accepts the match without human review but logs it for periodic audit.</w:t>
@@ -4266,7 +4839,30 @@
         <w:t xml:space="preserve"> </w:t>
       </w:r>
       <w:r>
-        <w:t xml:space="preserve">certified by a governance committee as the authoritative source of truth for key metrics. While many users can create and validate queries, only these certified triples serve as official standards, mitigating Shadow IT risks while preserving analytical agility.</w:t>
+        <w:t xml:space="preserve">certified by a governance committee as the authoritative source of truth for key metrics. While many users can create and validate queries, only these certified triples serve as official standards, mitigating Shadow IT risks</w:t>
+      </w:r>
+      <w:r>
+        <w:t xml:space="preserve"> </w:t>
+      </w:r>
+      <w:r>
+        <w:t xml:space="preserve">(</w:t>
+      </w:r>
+      <w:hyperlink w:anchor="ref-zimmermann2017">
+        <w:r>
+          <w:rPr>
+            <w:rStyle w:val="Hyperlink"/>
+          </w:rPr>
+          <w:t xml:space="preserve">67</w:t>
+        </w:r>
+      </w:hyperlink>
+      <w:r>
+        <w:t xml:space="preserve">)</w:t>
+      </w:r>
+      <w:r>
+        <w:t xml:space="preserve"> </w:t>
+      </w:r>
+      <w:r>
+        <w:t xml:space="preserve">while preserving analytical agility.</w:t>
       </w:r>
     </w:p>
     <w:bookmarkEnd w:id="30"/>
@@ -4293,7 +4889,7 @@
         <w:pStyle w:val="FirstParagraph"/>
       </w:pPr>
       <w:r>
-        <w:t xml:space="preserve">HiL-SG is fundamentally a</w:t>
+        <w:t xml:space="preserve">HITL-KG is fundamentally a</w:t>
       </w:r>
       <w:r>
         <w:t xml:space="preserve"> </w:t>
@@ -4323,7 +4919,7 @@
         <w:pStyle w:val="BodyText"/>
       </w:pPr>
       <w:r>
-        <w:t xml:space="preserve">HiL-SG mitigates this risk through</w:t>
+        <w:t xml:space="preserve">HITL-KG mitigates this risk through</w:t>
       </w:r>
       <w:r>
         <w:t xml:space="preserve"> </w:t>
@@ -4346,7 +4942,7 @@
           <w:rPr>
             <w:rStyle w:val="Hyperlink"/>
           </w:rPr>
-          <w:t xml:space="preserve">28</w:t>
+          <w:t xml:space="preserve">29</w:t>
         </w:r>
       </w:hyperlink>
       <w:r>
@@ -4382,7 +4978,7 @@
           <w:rPr>
             <w:rStyle w:val="Hyperlink"/>
           </w:rPr>
-          <w:t xml:space="preserve">67</w:t>
+          <w:t xml:space="preserve">68</w:t>
         </w:r>
       </w:hyperlink>
       <w:r>
@@ -4397,7 +4993,7 @@
         <w:pStyle w:val="BodyText"/>
       </w:pPr>
       <w:r>
-        <w:t xml:space="preserve">The parallel to aviation safety is instructive. Checklists and mandatory call-outs transformed commercial aviation from a high-risk endeavor into one of the safest modes of transportation, not by eliminating human error but by creating procedural structures that surface errors before they propagate. HiL-SG applies the same principle to analytics: the mandatory validation step functions as an analytical</w:t>
+        <w:t xml:space="preserve">The parallel to aviation safety is instructive. Checklists and mandatory call-outs transformed commercial aviation from a high-risk endeavor into one of the safest modes of transportation, not by eliminating human error but by creating procedural structures that surface errors before they propagate. HITL-KG applies the same principle to analytics: the mandatory validation step functions as an analytical</w:t>
       </w:r>
       <w:r>
         <w:t xml:space="preserve"> </w:t>
@@ -4449,7 +5045,7 @@
           <w:rPr>
             <w:rStyle w:val="Hyperlink"/>
           </w:rPr>
-          <w:t xml:space="preserve">68</w:t>
+          <w:t xml:space="preserve">69</w:t>
         </w:r>
       </w:hyperlink>
       <w:r>
@@ -4460,7 +5056,7 @@
           <w:rPr>
             <w:rStyle w:val="Hyperlink"/>
           </w:rPr>
-          <w:t xml:space="preserve">69</w:t>
+          <w:t xml:space="preserve">70</w:t>
         </w:r>
       </w:hyperlink>
       <w:r>
@@ -4480,7 +5076,7 @@
           <w:rPr>
             <w:rStyle w:val="Hyperlink"/>
           </w:rPr>
-          <w:t xml:space="preserve">70</w:t>
+          <w:t xml:space="preserve">71</w:t>
         </w:r>
       </w:hyperlink>
       <w:r>
@@ -4491,7 +5087,7 @@
           <w:rPr>
             <w:rStyle w:val="Hyperlink"/>
           </w:rPr>
-          <w:t xml:space="preserve">71</w:t>
+          <w:t xml:space="preserve">72</w:t>
         </w:r>
       </w:hyperlink>
       <w:r>
@@ -4534,14 +5130,14 @@
           <w:rPr>
             <w:rStyle w:val="Hyperlink"/>
           </w:rPr>
-          <w:t xml:space="preserve">72</w:t>
+          <w:t xml:space="preserve">73</w:t>
         </w:r>
       </w:hyperlink>
       <w:r>
         <w:t xml:space="preserve">)</w:t>
       </w:r>
       <w:r>
-        <w:t xml:space="preserve">. HiL-SG addresses this by capturing</w:t>
+        <w:t xml:space="preserve">. HITL-KG addresses this by capturing</w:t>
       </w:r>
       <w:r>
         <w:t xml:space="preserve"> </w:t>
@@ -4600,7 +5196,7 @@
         <w:pStyle w:val="FirstParagraph"/>
       </w:pPr>
       <w:r>
-        <w:t xml:space="preserve">This work is a narrative, design science informed framework rather than a systematic review or multi-site empirical evaluation. The literature base is concentrated on English-language sources and recent (2024-2026) workforce and NL2SQL studies, so findings may not capture all regional, specialty-specific, or technological contexts. The HiL-SG architecture and the proposed Analytics Resilience Index (ARI) are conceptual artifacts that require future implementation and validation in diverse health systems before their effectiveness and generalizability can be fully established.</w:t>
+        <w:t xml:space="preserve">This work is a narrative, design science informed framework rather than a systematic review or multi-site empirical evaluation. The literature base is concentrated on English-language sources and recent (2024-2026) workforce and NL2SQL studies, so findings may not capture all regional, specialty-specific, or technological contexts. The HITL-KG architecture and the proposed Three-Pillar Assessment Rubric are conceptual artifacts that require future implementation and validation in diverse health systems before their effectiveness and generalizability can be fully established.</w:t>
       </w:r>
     </w:p>
     <w:bookmarkEnd w:id="33"/>
@@ -4637,7 +5233,7 @@
           <w:b/>
           <w:bCs/>
         </w:rPr>
-        <w:t xml:space="preserve">Human-in-the-Loop Semantic Governance</w:t>
+        <w:t xml:space="preserve">Human-in-the-Loop Knowledge Governance</w:t>
       </w:r>
       <w:r>
         <w:t xml:space="preserve">, health systems can decouple intelligence from turnover, building a library of validated knowledge that ensures maturity advances even as the workforce evolves.</w:t>
@@ -4648,7 +5244,7 @@
         <w:pStyle w:val="BodyText"/>
       </w:pPr>
       <w:r>
-        <w:t xml:space="preserve">Future research should empirically validate and refine the HiL-SG framework and the proposed Analytics Resilience Index. Priority questions include: how ARI scores correlate with observed continuity of analytics performance during leadership and staff turnover; whether HiL-SG mediated natural language to SQL workflows reduce error rates, recovery time, and rework compared to baseline tooling; and which governance patterns most effectively balance safety, transparency, and equity when human validators operate at scale. Prospective multi-site implementation studies, controlled user experiments, and qualitative implementation research across diverse health systems will be needed to test these claims and adapt the framework to varying organizational, regulatory, and data environments.</w:t>
+        <w:t xml:space="preserve">Future research should empirically validate and refine the HITL-KG framework and the proposed Three-Pillar Assessment Rubric. Priority questions include: how pillar scores correlate with observed continuity of analytics performance during leadership and staff turnover; whether HITL-KG mediated natural language to SQL workflows reduce error rates, recovery time, and rework compared to baseline tooling; and which governance patterns most effectively balance safety, transparency, and equity when human validators operate at scale. Prospective multi-site implementation studies, controlled user experiments, and qualitative implementation research across diverse health systems will be needed to test these claims and adapt the framework to varying organizational, regulatory, and data environments.</w:t>
       </w:r>
     </w:p>
     <w:bookmarkEnd w:id="34"/>
@@ -4828,18 +5424,18 @@
         <w:t xml:space="preserve"> </w:t>
       </w:r>
       <w:r>
-        <w:t xml:space="preserve">ARI: Analytics Resilience Index</w:t>
-      </w:r>
-      <w:r>
-        <w:t xml:space="preserve"> </w:t>
-      </w:r>
-      <w:r>
         <w:t xml:space="preserve">CIO: Chief Information Officer</w:t>
       </w:r>
       <w:r>
         <w:t xml:space="preserve"> </w:t>
       </w:r>
       <w:r>
+        <w:t xml:space="preserve">DIKW: Data, Information, Knowledge, Wisdom</w:t>
+      </w:r>
+      <w:r>
+        <w:t xml:space="preserve"> </w:t>
+      </w:r>
+      <w:r>
         <w:t xml:space="preserve">DSR: Design Science Research</w:t>
       </w:r>
       <w:r>
@@ -4852,7 +5448,7 @@
         <w:t xml:space="preserve"> </w:t>
       </w:r>
       <w:r>
-        <w:t xml:space="preserve">HiL-SG: Human-in-the-Loop Semantic Governance</w:t>
+        <w:t xml:space="preserve">HITL-KG: Human-in-the-Loop Knowledge Governance</w:t>
       </w:r>
       <w:r>
         <w:t xml:space="preserve"> </w:t>
@@ -4864,7 +5460,7 @@
         <w:t xml:space="preserve"> </w:t>
       </w:r>
       <w:r>
-        <w:t xml:space="preserve">HotL: Human-on-the-Loop</w:t>
+        <w:t xml:space="preserve">HITL: Human-in-the-Loop</w:t>
       </w:r>
       <w:r>
         <w:t xml:space="preserve"> </w:t>
@@ -4892,7 +5488,7 @@
       </w:r>
     </w:p>
     <w:bookmarkEnd w:id="40"/>
-    <w:bookmarkStart w:id="185" w:name="references"/>
+    <w:bookmarkStart w:id="187" w:name="references"/>
     <w:p>
       <w:pPr>
         <w:pStyle w:val="Heading1"/>
@@ -4910,7 +5506,7 @@
         <w:t xml:space="preserve">References</w:t>
       </w:r>
     </w:p>
-    <w:bookmarkStart w:id="184" w:name="refs"/>
+    <w:bookmarkStart w:id="186" w:name="refs"/>
     <w:bookmarkStart w:id="42" w:name="ref-himss2024"/>
     <w:p>
       <w:pPr>
@@ -6022,7 +6618,7 @@
       </w:hyperlink>
     </w:p>
     <w:bookmarkEnd w:id="91"/>
-    <w:bookmarkStart w:id="93" w:name="ref-lee2023"/>
+    <w:bookmarkStart w:id="93" w:name="ref-foss2007"/>
     <w:p>
       <w:pPr>
         <w:pStyle w:val="Bibliography"/>
@@ -6037,6 +6633,45 @@
         <w:t xml:space="preserve">	</w:t>
       </w:r>
       <w:r>
+        <w:t xml:space="preserve">Foss NJ.</w:t>
+      </w:r>
+      <w:r>
+        <w:t xml:space="preserve"> </w:t>
+      </w:r>
+      <w:r>
+        <w:t xml:space="preserve">The emerging knowledge governance approach: Challenges and characteristics</w:t>
+      </w:r>
+      <w:r>
+        <w:t xml:space="preserve">. Organization [Internet]. 2007;14(1):29–52. Available from:</w:t>
+      </w:r>
+      <w:r>
+        <w:t xml:space="preserve"> </w:t>
+      </w:r>
+      <w:hyperlink r:id="rId92">
+        <w:r>
+          <w:rPr>
+            <w:rStyle w:val="Hyperlink"/>
+          </w:rPr>
+          <w:t xml:space="preserve">https://journals.sagepub.com/doi/abs/10.1177/1350508407071859</w:t>
+        </w:r>
+      </w:hyperlink>
+    </w:p>
+    <w:bookmarkEnd w:id="93"/>
+    <w:bookmarkStart w:id="95" w:name="ref-lee2023"/>
+    <w:p>
+      <w:pPr>
+        <w:pStyle w:val="Bibliography"/>
+      </w:pPr>
+      <w:r>
+        <w:t xml:space="preserve">28.</w:t>
+      </w:r>
+      <w:r>
+        <w:t xml:space="preserve"> </w:t>
+      </w:r>
+      <w:r>
+        <w:t xml:space="preserve">	</w:t>
+      </w:r>
+      <w:r>
         <w:t xml:space="preserve">Lee et al G.</w:t>
       </w:r>
       <w:r>
@@ -6051,7 +6686,7 @@
       <w:r>
         <w:t xml:space="preserve"> </w:t>
       </w:r>
-      <w:hyperlink r:id="rId92">
+      <w:hyperlink r:id="rId94">
         <w:r>
           <w:rPr>
             <w:rStyle w:val="Hyperlink"/>
@@ -6060,14 +6695,14 @@
         </w:r>
       </w:hyperlink>
     </w:p>
-    <w:bookmarkEnd w:id="93"/>
-    <w:bookmarkStart w:id="95" w:name="ref-ziletti2024"/>
+    <w:bookmarkEnd w:id="95"/>
+    <w:bookmarkStart w:id="97" w:name="ref-ziletti2024"/>
     <w:p>
       <w:pPr>
         <w:pStyle w:val="Bibliography"/>
       </w:pPr>
       <w:r>
-        <w:t xml:space="preserve">28.</w:t>
+        <w:t xml:space="preserve">29.</w:t>
       </w:r>
       <w:r>
         <w:t xml:space="preserve"> </w:t>
@@ -6114,7 +6749,7 @@
       <w:r>
         <w:t xml:space="preserve"> </w:t>
       </w:r>
-      <w:hyperlink r:id="rId94">
+      <w:hyperlink r:id="rId96">
         <w:r>
           <w:rPr>
             <w:rStyle w:val="Hyperlink"/>
@@ -6123,14 +6758,14 @@
         </w:r>
       </w:hyperlink>
     </w:p>
-    <w:bookmarkEnd w:id="95"/>
-    <w:bookmarkStart w:id="97" w:name="ref-bravorocca2023"/>
+    <w:bookmarkEnd w:id="97"/>
+    <w:bookmarkStart w:id="99" w:name="ref-bravorocca2023"/>
     <w:p>
       <w:pPr>
         <w:pStyle w:val="Bibliography"/>
       </w:pPr>
       <w:r>
-        <w:t xml:space="preserve">29.</w:t>
+        <w:t xml:space="preserve">30.</w:t>
       </w:r>
       <w:r>
         <w:t xml:space="preserve"> </w:t>
@@ -6150,7 +6785,7 @@
       <w:r>
         <w:t xml:space="preserve"> </w:t>
       </w:r>
-      <w:hyperlink r:id="rId96">
+      <w:hyperlink r:id="rId98">
         <w:r>
           <w:rPr>
             <w:rStyle w:val="Hyperlink"/>
@@ -6159,14 +6794,14 @@
         </w:r>
       </w:hyperlink>
     </w:p>
-    <w:bookmarkEnd w:id="97"/>
-    <w:bookmarkStart w:id="99" w:name="ref-mosqueirarey2023"/>
+    <w:bookmarkEnd w:id="99"/>
+    <w:bookmarkStart w:id="101" w:name="ref-mosqueirarey2023"/>
     <w:p>
       <w:pPr>
         <w:pStyle w:val="Bibliography"/>
       </w:pPr>
       <w:r>
-        <w:t xml:space="preserve">30.</w:t>
+        <w:t xml:space="preserve">31.</w:t>
       </w:r>
       <w:r>
         <w:t xml:space="preserve"> </w:t>
@@ -6183,7 +6818,7 @@
       <w:r>
         <w:t xml:space="preserve"> </w:t>
       </w:r>
-      <w:hyperlink r:id="rId98">
+      <w:hyperlink r:id="rId100">
         <w:r>
           <w:rPr>
             <w:rStyle w:val="Hyperlink"/>
@@ -6192,14 +6827,14 @@
         </w:r>
       </w:hyperlink>
     </w:p>
-    <w:bookmarkEnd w:id="99"/>
-    <w:bookmarkStart w:id="101" w:name="ref-benbya2004"/>
+    <w:bookmarkEnd w:id="101"/>
+    <w:bookmarkStart w:id="103" w:name="ref-benbya2004"/>
     <w:p>
       <w:pPr>
         <w:pStyle w:val="Bibliography"/>
       </w:pPr>
       <w:r>
-        <w:t xml:space="preserve">31.</w:t>
+        <w:t xml:space="preserve">32.</w:t>
       </w:r>
       <w:r>
         <w:t xml:space="preserve"> </w:t>
@@ -6222,7 +6857,7 @@
       <w:r>
         <w:t xml:space="preserve"> </w:t>
       </w:r>
-      <w:hyperlink r:id="rId100">
+      <w:hyperlink r:id="rId102">
         <w:r>
           <w:rPr>
             <w:rStyle w:val="Hyperlink"/>
@@ -6231,14 +6866,14 @@
         </w:r>
       </w:hyperlink>
     </w:p>
-    <w:bookmarkEnd w:id="101"/>
-    <w:bookmarkStart w:id="103" w:name="ref-whittaker2008"/>
+    <w:bookmarkEnd w:id="103"/>
+    <w:bookmarkStart w:id="105" w:name="ref-whittaker2008"/>
     <w:p>
       <w:pPr>
         <w:pStyle w:val="Bibliography"/>
       </w:pPr>
       <w:r>
-        <w:t xml:space="preserve">32.</w:t>
+        <w:t xml:space="preserve">33.</w:t>
       </w:r>
       <w:r>
         <w:t xml:space="preserve"> </w:t>
@@ -6252,7 +6887,7 @@
       <w:r>
         <w:t xml:space="preserve"> </w:t>
       </w:r>
-      <w:hyperlink r:id="rId102">
+      <w:hyperlink r:id="rId104">
         <w:r>
           <w:rPr>
             <w:rStyle w:val="Hyperlink"/>
@@ -6261,14 +6896,14 @@
         </w:r>
       </w:hyperlink>
     </w:p>
-    <w:bookmarkEnd w:id="103"/>
-    <w:bookmarkStart w:id="105" w:name="ref-mannapur2025"/>
+    <w:bookmarkEnd w:id="105"/>
+    <w:bookmarkStart w:id="107" w:name="ref-mannapur2025"/>
     <w:p>
       <w:pPr>
         <w:pStyle w:val="Bibliography"/>
       </w:pPr>
       <w:r>
-        <w:t xml:space="preserve">33.</w:t>
+        <w:t xml:space="preserve">34.</w:t>
       </w:r>
       <w:r>
         <w:t xml:space="preserve"> </w:t>
@@ -6282,7 +6917,7 @@
       <w:r>
         <w:t xml:space="preserve"> </w:t>
       </w:r>
-      <w:hyperlink r:id="rId104">
+      <w:hyperlink r:id="rId106">
         <w:r>
           <w:rPr>
             <w:rStyle w:val="Hyperlink"/>
@@ -6291,14 +6926,14 @@
         </w:r>
       </w:hyperlink>
     </w:p>
-    <w:bookmarkEnd w:id="105"/>
-    <w:bookmarkStart w:id="107" w:name="ref-battula2025"/>
+    <w:bookmarkEnd w:id="107"/>
+    <w:bookmarkStart w:id="109" w:name="ref-battula2025"/>
     <w:p>
       <w:pPr>
         <w:pStyle w:val="Bibliography"/>
       </w:pPr>
       <w:r>
-        <w:t xml:space="preserve">34.</w:t>
+        <w:t xml:space="preserve">35.</w:t>
       </w:r>
       <w:r>
         <w:t xml:space="preserve"> </w:t>
@@ -6312,7 +6947,7 @@
       <w:r>
         <w:t xml:space="preserve"> </w:t>
       </w:r>
-      <w:hyperlink r:id="rId106">
+      <w:hyperlink r:id="rId108">
         <w:r>
           <w:rPr>
             <w:rStyle w:val="Hyperlink"/>
@@ -6327,14 +6962,14 @@
         <w:t xml:space="preserve"> </w:t>
       </w:r>
     </w:p>
-    <w:bookmarkEnd w:id="107"/>
-    <w:bookmarkStart w:id="109" w:name="ref-himss2024news"/>
+    <w:bookmarkEnd w:id="109"/>
+    <w:bookmarkStart w:id="111" w:name="ref-himss2024news"/>
     <w:p>
       <w:pPr>
         <w:pStyle w:val="Bibliography"/>
       </w:pPr>
       <w:r>
-        <w:t xml:space="preserve">35.</w:t>
+        <w:t xml:space="preserve">36.</w:t>
       </w:r>
       <w:r>
         <w:t xml:space="preserve"> </w:t>
@@ -6360,7 +6995,7 @@
       <w:r>
         <w:t xml:space="preserve"> </w:t>
       </w:r>
-      <w:hyperlink r:id="rId108">
+      <w:hyperlink r:id="rId110">
         <w:r>
           <w:rPr>
             <w:rStyle w:val="Hyperlink"/>
@@ -6369,14 +7004,14 @@
         </w:r>
       </w:hyperlink>
     </w:p>
-    <w:bookmarkEnd w:id="109"/>
-    <w:bookmarkStart w:id="111" w:name="ref-health2020"/>
+    <w:bookmarkEnd w:id="111"/>
+    <w:bookmarkStart w:id="113" w:name="ref-health2020"/>
     <w:p>
       <w:pPr>
         <w:pStyle w:val="Bibliography"/>
       </w:pPr>
       <w:r>
-        <w:t xml:space="preserve">36.</w:t>
+        <w:t xml:space="preserve">37.</w:t>
       </w:r>
       <w:r>
         <w:t xml:space="preserve"> </w:t>
@@ -6402,7 +7037,7 @@
       <w:r>
         <w:t xml:space="preserve"> </w:t>
       </w:r>
-      <w:hyperlink r:id="rId110">
+      <w:hyperlink r:id="rId112">
         <w:r>
           <w:rPr>
             <w:rStyle w:val="Hyperlink"/>
@@ -6411,14 +7046,14 @@
         </w:r>
       </w:hyperlink>
     </w:p>
-    <w:bookmarkEnd w:id="111"/>
-    <w:bookmarkStart w:id="113" w:name="ref-snowdon2024"/>
+    <w:bookmarkEnd w:id="113"/>
+    <w:bookmarkStart w:id="115" w:name="ref-snowdon2024"/>
     <w:p>
       <w:pPr>
         <w:pStyle w:val="Bibliography"/>
       </w:pPr>
       <w:r>
-        <w:t xml:space="preserve">37.</w:t>
+        <w:t xml:space="preserve">38.</w:t>
       </w:r>
       <w:r>
         <w:t xml:space="preserve"> </w:t>
@@ -6453,7 +7088,7 @@
       <w:r>
         <w:t xml:space="preserve"> </w:t>
       </w:r>
-      <w:hyperlink r:id="rId112">
+      <w:hyperlink r:id="rId114">
         <w:r>
           <w:rPr>
             <w:rStyle w:val="Hyperlink"/>
@@ -6462,14 +7097,14 @@
         </w:r>
       </w:hyperlink>
     </w:p>
-    <w:bookmarkEnd w:id="113"/>
-    <w:bookmarkStart w:id="115" w:name="ref-yang2021"/>
+    <w:bookmarkEnd w:id="115"/>
+    <w:bookmarkStart w:id="117" w:name="ref-yang2021"/>
     <w:p>
       <w:pPr>
         <w:pStyle w:val="Bibliography"/>
       </w:pPr>
       <w:r>
-        <w:t xml:space="preserve">38.</w:t>
+        <w:t xml:space="preserve">39.</w:t>
       </w:r>
       <w:r>
         <w:t xml:space="preserve"> </w:t>
@@ -6492,7 +7127,7 @@
       <w:r>
         <w:t xml:space="preserve"> </w:t>
       </w:r>
-      <w:hyperlink r:id="rId114">
+      <w:hyperlink r:id="rId116">
         <w:r>
           <w:rPr>
             <w:rStyle w:val="Hyperlink"/>
@@ -6501,14 +7136,14 @@
         </w:r>
       </w:hyperlink>
     </w:p>
-    <w:bookmarkEnd w:id="115"/>
-    <w:bookmarkStart w:id="117" w:name="ref-latrella2024"/>
+    <w:bookmarkEnd w:id="117"/>
+    <w:bookmarkStart w:id="119" w:name="ref-latrella2024"/>
     <w:p>
       <w:pPr>
         <w:pStyle w:val="Bibliography"/>
       </w:pPr>
       <w:r>
-        <w:t xml:space="preserve">39.</w:t>
+        <w:t xml:space="preserve">40.</w:t>
       </w:r>
       <w:r>
         <w:t xml:space="preserve"> </w:t>
@@ -6531,7 +7166,7 @@
       <w:r>
         <w:t xml:space="preserve"> </w:t>
       </w:r>
-      <w:hyperlink r:id="rId116">
+      <w:hyperlink r:id="rId118">
         <w:r>
           <w:rPr>
             <w:rStyle w:val="Hyperlink"/>
@@ -6540,14 +7175,14 @@
         </w:r>
       </w:hyperlink>
     </w:p>
-    <w:bookmarkEnd w:id="117"/>
-    <w:bookmarkStart w:id="119" w:name="ref-nashid2023"/>
+    <w:bookmarkEnd w:id="119"/>
+    <w:bookmarkStart w:id="121" w:name="ref-nashid2023"/>
     <w:p>
       <w:pPr>
         <w:pStyle w:val="Bibliography"/>
       </w:pPr>
       <w:r>
-        <w:t xml:space="preserve">40.</w:t>
+        <w:t xml:space="preserve">41.</w:t>
       </w:r>
       <w:r>
         <w:t xml:space="preserve"> </w:t>
@@ -6570,7 +7205,7 @@
       <w:r>
         <w:t xml:space="preserve"> </w:t>
       </w:r>
-      <w:hyperlink r:id="rId118">
+      <w:hyperlink r:id="rId120">
         <w:r>
           <w:rPr>
             <w:rStyle w:val="Hyperlink"/>
@@ -6579,14 +7214,14 @@
         </w:r>
       </w:hyperlink>
     </w:p>
-    <w:bookmarkEnd w:id="119"/>
-    <w:bookmarkStart w:id="121" w:name="ref-shahbaz2019"/>
+    <w:bookmarkEnd w:id="121"/>
+    <w:bookmarkStart w:id="123" w:name="ref-shahbaz2019"/>
     <w:p>
       <w:pPr>
         <w:pStyle w:val="Bibliography"/>
       </w:pPr>
       <w:r>
-        <w:t xml:space="preserve">41.</w:t>
+        <w:t xml:space="preserve">42.</w:t>
       </w:r>
       <w:r>
         <w:t xml:space="preserve"> </w:t>
@@ -6609,7 +7244,7 @@
       <w:r>
         <w:t xml:space="preserve"> </w:t>
       </w:r>
-      <w:hyperlink r:id="rId120">
+      <w:hyperlink r:id="rId122">
         <w:r>
           <w:rPr>
             <w:rStyle w:val="Hyperlink"/>
@@ -6618,14 +7253,14 @@
         </w:r>
       </w:hyperlink>
     </w:p>
-    <w:bookmarkEnd w:id="121"/>
-    <w:bookmarkStart w:id="123" w:name="ref-kamble2019"/>
+    <w:bookmarkEnd w:id="123"/>
+    <w:bookmarkStart w:id="125" w:name="ref-kamble2019"/>
     <w:p>
       <w:pPr>
         <w:pStyle w:val="Bibliography"/>
       </w:pPr>
       <w:r>
-        <w:t xml:space="preserve">42.</w:t>
+        <w:t xml:space="preserve">43.</w:t>
       </w:r>
       <w:r>
         <w:t xml:space="preserve"> </w:t>
@@ -6648,7 +7283,7 @@
       <w:r>
         <w:t xml:space="preserve"> </w:t>
       </w:r>
-      <w:hyperlink r:id="rId122">
+      <w:hyperlink r:id="rId124">
         <w:r>
           <w:rPr>
             <w:rStyle w:val="Hyperlink"/>
@@ -6657,14 +7292,14 @@
         </w:r>
       </w:hyperlink>
     </w:p>
-    <w:bookmarkEnd w:id="123"/>
-    <w:bookmarkStart w:id="125" w:name="ref-wynendaele2025"/>
+    <w:bookmarkEnd w:id="125"/>
+    <w:bookmarkStart w:id="127" w:name="ref-wynendaele2025"/>
     <w:p>
       <w:pPr>
         <w:pStyle w:val="Bibliography"/>
       </w:pPr>
       <w:r>
-        <w:t xml:space="preserve">43.</w:t>
+        <w:t xml:space="preserve">44.</w:t>
       </w:r>
       <w:r>
         <w:t xml:space="preserve"> </w:t>
@@ -6687,7 +7322,7 @@
       <w:r>
         <w:t xml:space="preserve"> </w:t>
       </w:r>
-      <w:hyperlink r:id="rId124">
+      <w:hyperlink r:id="rId126">
         <w:r>
           <w:rPr>
             <w:rStyle w:val="Hyperlink"/>
@@ -6696,14 +7331,14 @@
         </w:r>
       </w:hyperlink>
     </w:p>
-    <w:bookmarkEnd w:id="125"/>
-    <w:bookmarkStart w:id="127" w:name="ref-hackney2024"/>
+    <w:bookmarkEnd w:id="127"/>
+    <w:bookmarkStart w:id="129" w:name="ref-hackney2024"/>
     <w:p>
       <w:pPr>
         <w:pStyle w:val="Bibliography"/>
       </w:pPr>
       <w:r>
-        <w:t xml:space="preserve">44.</w:t>
+        <w:t xml:space="preserve">45.</w:t>
       </w:r>
       <w:r>
         <w:t xml:space="preserve"> </w:t>
@@ -6729,7 +7364,7 @@
       <w:r>
         <w:t xml:space="preserve"> </w:t>
       </w:r>
-      <w:hyperlink r:id="rId126">
+      <w:hyperlink r:id="rId128">
         <w:r>
           <w:rPr>
             <w:rStyle w:val="Hyperlink"/>
@@ -6738,14 +7373,14 @@
         </w:r>
       </w:hyperlink>
     </w:p>
-    <w:bookmarkEnd w:id="127"/>
-    <w:bookmarkStart w:id="129" w:name="ref-blaskovic2025"/>
+    <w:bookmarkEnd w:id="129"/>
+    <w:bookmarkStart w:id="131" w:name="ref-blaskovic2025"/>
     <w:p>
       <w:pPr>
         <w:pStyle w:val="Bibliography"/>
       </w:pPr>
       <w:r>
-        <w:t xml:space="preserve">45.</w:t>
+        <w:t xml:space="preserve">46.</w:t>
       </w:r>
       <w:r>
         <w:t xml:space="preserve"> </w:t>
@@ -6768,7 +7403,7 @@
       <w:r>
         <w:t xml:space="preserve"> </w:t>
       </w:r>
-      <w:hyperlink r:id="rId128">
+      <w:hyperlink r:id="rId130">
         <w:r>
           <w:rPr>
             <w:rStyle w:val="Hyperlink"/>
@@ -6777,14 +7412,14 @@
         </w:r>
       </w:hyperlink>
     </w:p>
-    <w:bookmarkEnd w:id="129"/>
-    <w:bookmarkStart w:id="131" w:name="ref-marshan2024"/>
+    <w:bookmarkEnd w:id="131"/>
+    <w:bookmarkStart w:id="133" w:name="ref-marshan2024"/>
     <w:p>
       <w:pPr>
         <w:pStyle w:val="Bibliography"/>
       </w:pPr>
       <w:r>
-        <w:t xml:space="preserve">46.</w:t>
+        <w:t xml:space="preserve">47.</w:t>
       </w:r>
       <w:r>
         <w:t xml:space="preserve"> </w:t>
@@ -6807,7 +7442,7 @@
       <w:r>
         <w:t xml:space="preserve"> </w:t>
       </w:r>
-      <w:hyperlink r:id="rId130">
+      <w:hyperlink r:id="rId132">
         <w:r>
           <w:rPr>
             <w:rStyle w:val="Hyperlink"/>
@@ -6816,14 +7451,14 @@
         </w:r>
       </w:hyperlink>
     </w:p>
-    <w:bookmarkEnd w:id="131"/>
-    <w:bookmarkStart w:id="133" w:name="ref-chen2026graph"/>
+    <w:bookmarkEnd w:id="133"/>
+    <w:bookmarkStart w:id="135" w:name="ref-chen2026graph"/>
     <w:p>
       <w:pPr>
         <w:pStyle w:val="Bibliography"/>
       </w:pPr>
       <w:r>
-        <w:t xml:space="preserve">47.</w:t>
+        <w:t xml:space="preserve">48.</w:t>
       </w:r>
       <w:r>
         <w:t xml:space="preserve"> </w:t>
@@ -6846,7 +7481,7 @@
       <w:r>
         <w:t xml:space="preserve"> </w:t>
       </w:r>
-      <w:hyperlink r:id="rId132">
+      <w:hyperlink r:id="rId134">
         <w:r>
           <w:rPr>
             <w:rStyle w:val="Hyperlink"/>
@@ -6855,14 +7490,14 @@
         </w:r>
       </w:hyperlink>
     </w:p>
-    <w:bookmarkEnd w:id="133"/>
-    <w:bookmarkStart w:id="135" w:name="ref-tarbell2024"/>
+    <w:bookmarkEnd w:id="135"/>
+    <w:bookmarkStart w:id="137" w:name="ref-tarbell2024"/>
     <w:p>
       <w:pPr>
         <w:pStyle w:val="Bibliography"/>
       </w:pPr>
       <w:r>
-        <w:t xml:space="preserve">48.</w:t>
+        <w:t xml:space="preserve">49.</w:t>
       </w:r>
       <w:r>
         <w:t xml:space="preserve"> </w:t>
@@ -6885,7 +7520,7 @@
       <w:r>
         <w:t xml:space="preserve"> </w:t>
       </w:r>
-      <w:hyperlink r:id="rId134">
+      <w:hyperlink r:id="rId136">
         <w:r>
           <w:rPr>
             <w:rStyle w:val="Hyperlink"/>
@@ -6894,14 +7529,14 @@
         </w:r>
       </w:hyperlink>
     </w:p>
-    <w:bookmarkEnd w:id="135"/>
-    <w:bookmarkStart w:id="137" w:name="ref-yuan2019"/>
+    <w:bookmarkEnd w:id="137"/>
+    <w:bookmarkStart w:id="139" w:name="ref-yuan2019"/>
     <w:p>
       <w:pPr>
         <w:pStyle w:val="Bibliography"/>
       </w:pPr>
       <w:r>
-        <w:t xml:space="preserve">49.</w:t>
+        <w:t xml:space="preserve">50.</w:t>
       </w:r>
       <w:r>
         <w:t xml:space="preserve"> </w:t>
@@ -6924,7 +7559,7 @@
       <w:r>
         <w:t xml:space="preserve"> </w:t>
       </w:r>
-      <w:hyperlink r:id="rId136">
+      <w:hyperlink r:id="rId138">
         <w:r>
           <w:rPr>
             <w:rStyle w:val="Hyperlink"/>
@@ -6933,14 +7568,14 @@
         </w:r>
       </w:hyperlink>
     </w:p>
-    <w:bookmarkEnd w:id="137"/>
-    <w:bookmarkStart w:id="139" w:name="ref-nittala2024"/>
+    <w:bookmarkEnd w:id="139"/>
+    <w:bookmarkStart w:id="141" w:name="ref-nittala2024"/>
     <w:p>
       <w:pPr>
         <w:pStyle w:val="Bibliography"/>
       </w:pPr>
       <w:r>
-        <w:t xml:space="preserve">50.</w:t>
+        <w:t xml:space="preserve">51.</w:t>
       </w:r>
       <w:r>
         <w:t xml:space="preserve"> </w:t>
@@ -6963,7 +7598,7 @@
       <w:r>
         <w:t xml:space="preserve"> </w:t>
       </w:r>
-      <w:hyperlink r:id="rId138">
+      <w:hyperlink r:id="rId140">
         <w:r>
           <w:rPr>
             <w:rStyle w:val="Hyperlink"/>
@@ -6972,14 +7607,14 @@
         </w:r>
       </w:hyperlink>
     </w:p>
-    <w:bookmarkEnd w:id="139"/>
-    <w:bookmarkStart w:id="141" w:name="ref-anthropic2025"/>
+    <w:bookmarkEnd w:id="141"/>
+    <w:bookmarkStart w:id="143" w:name="ref-anthropic2025"/>
     <w:p>
       <w:pPr>
         <w:pStyle w:val="Bibliography"/>
       </w:pPr>
       <w:r>
-        <w:t xml:space="preserve">51.</w:t>
+        <w:t xml:space="preserve">52.</w:t>
       </w:r>
       <w:r>
         <w:t xml:space="preserve"> </w:t>
@@ -7011,7 +7646,7 @@
       <w:r>
         <w:t xml:space="preserve"> </w:t>
       </w:r>
-      <w:hyperlink r:id="rId140">
+      <w:hyperlink r:id="rId142">
         <w:r>
           <w:rPr>
             <w:rStyle w:val="Hyperlink"/>
@@ -7020,14 +7655,14 @@
         </w:r>
       </w:hyperlink>
     </w:p>
-    <w:bookmarkEnd w:id="141"/>
-    <w:bookmarkStart w:id="143" w:name="ref-hendrix1978"/>
+    <w:bookmarkEnd w:id="143"/>
+    <w:bookmarkStart w:id="145" w:name="ref-hendrix1978"/>
     <w:p>
       <w:pPr>
         <w:pStyle w:val="Bibliography"/>
       </w:pPr>
       <w:r>
-        <w:t xml:space="preserve">52.</w:t>
+        <w:t xml:space="preserve">53.</w:t>
       </w:r>
       <w:r>
         <w:t xml:space="preserve"> </w:t>
@@ -7062,7 +7697,7 @@
       <w:r>
         <w:t xml:space="preserve"> </w:t>
       </w:r>
-      <w:hyperlink r:id="rId142">
+      <w:hyperlink r:id="rId144">
         <w:r>
           <w:rPr>
             <w:rStyle w:val="Hyperlink"/>
@@ -7071,14 +7706,14 @@
         </w:r>
       </w:hyperlink>
     </w:p>
-    <w:bookmarkEnd w:id="143"/>
-    <w:bookmarkStart w:id="145" w:name="ref-ogunwole2023"/>
+    <w:bookmarkEnd w:id="145"/>
+    <w:bookmarkStart w:id="147" w:name="ref-ogunwole2023"/>
     <w:p>
       <w:pPr>
         <w:pStyle w:val="Bibliography"/>
       </w:pPr>
       <w:r>
-        <w:t xml:space="preserve">53.</w:t>
+        <w:t xml:space="preserve">54.</w:t>
       </w:r>
       <w:r>
         <w:t xml:space="preserve"> </w:t>
@@ -7101,7 +7736,7 @@
       <w:r>
         <w:t xml:space="preserve"> </w:t>
       </w:r>
-      <w:hyperlink r:id="rId144">
+      <w:hyperlink r:id="rId146">
         <w:r>
           <w:rPr>
             <w:rStyle w:val="Hyperlink"/>
@@ -7110,14 +7745,14 @@
         </w:r>
       </w:hyperlink>
     </w:p>
-    <w:bookmarkEnd w:id="145"/>
-    <w:bookmarkStart w:id="147" w:name="ref-arora2025"/>
+    <w:bookmarkEnd w:id="147"/>
+    <w:bookmarkStart w:id="149" w:name="ref-arora2025"/>
     <w:p>
       <w:pPr>
         <w:pStyle w:val="Bibliography"/>
       </w:pPr>
       <w:r>
-        <w:t xml:space="preserve">54.</w:t>
+        <w:t xml:space="preserve">55.</w:t>
       </w:r>
       <w:r>
         <w:t xml:space="preserve"> </w:t>
@@ -7152,7 +7787,7 @@
       <w:r>
         <w:t xml:space="preserve"> </w:t>
       </w:r>
-      <w:hyperlink r:id="rId146">
+      <w:hyperlink r:id="rId148">
         <w:r>
           <w:rPr>
             <w:rStyle w:val="Hyperlink"/>
@@ -7161,14 +7796,14 @@
         </w:r>
       </w:hyperlink>
     </w:p>
-    <w:bookmarkEnd w:id="147"/>
-    <w:bookmarkStart w:id="149" w:name="ref-valiaiev2025"/>
+    <w:bookmarkEnd w:id="149"/>
+    <w:bookmarkStart w:id="151" w:name="ref-ignatowicz2023"/>
     <w:p>
       <w:pPr>
         <w:pStyle w:val="Bibliography"/>
       </w:pPr>
       <w:r>
-        <w:t xml:space="preserve">55.</w:t>
+        <w:t xml:space="preserve">56.</w:t>
       </w:r>
       <w:r>
         <w:t xml:space="preserve"> </w:t>
@@ -7177,6 +7812,84 @@
         <w:t xml:space="preserve">	</w:t>
       </w:r>
       <w:r>
+        <w:t xml:space="preserve">Ignatowicz A, Tarrant C, Mannion R, El-Sawy D, et al.</w:t>
+      </w:r>
+      <w:r>
+        <w:t xml:space="preserve"> </w:t>
+      </w:r>
+      <w:r>
+        <w:t xml:space="preserve">Organizational resilience in healthcare: a review and descriptive narrative synthesis of approaches to resilience measurement and assessment in empirical studies</w:t>
+      </w:r>
+      <w:r>
+        <w:t xml:space="preserve">. BMC Health Services Research [Internet]. 2023;23:242. Available from:</w:t>
+      </w:r>
+      <w:r>
+        <w:t xml:space="preserve"> </w:t>
+      </w:r>
+      <w:hyperlink r:id="rId150">
+        <w:r>
+          <w:rPr>
+            <w:rStyle w:val="Hyperlink"/>
+          </w:rPr>
+          <w:t xml:space="preserve">https://link.springer.com/article/10.1186/s12913-023-09242-9</w:t>
+        </w:r>
+      </w:hyperlink>
+    </w:p>
+    <w:bookmarkEnd w:id="151"/>
+    <w:bookmarkStart w:id="153" w:name="ref-ratliff2025"/>
+    <w:p>
+      <w:pPr>
+        <w:pStyle w:val="Bibliography"/>
+      </w:pPr>
+      <w:r>
+        <w:t xml:space="preserve">57.</w:t>
+      </w:r>
+      <w:r>
+        <w:t xml:space="preserve"> </w:t>
+      </w:r>
+      <w:r>
+        <w:t xml:space="preserve">	</w:t>
+      </w:r>
+      <w:r>
+        <w:t xml:space="preserve">Ratliff HC, Lee KA, Buchbinder M, Kelly LA, et al.</w:t>
+      </w:r>
+      <w:r>
+        <w:t xml:space="preserve"> </w:t>
+      </w:r>
+      <w:r>
+        <w:t xml:space="preserve">Organizational resilience in healthcare: a scoping review</w:t>
+      </w:r>
+      <w:r>
+        <w:t xml:space="preserve">. Journal of Healthcare Management [Internet]. 2025;70(3). Available from:</w:t>
+      </w:r>
+      <w:r>
+        <w:t xml:space="preserve"> </w:t>
+      </w:r>
+      <w:hyperlink r:id="rId152">
+        <w:r>
+          <w:rPr>
+            <w:rStyle w:val="Hyperlink"/>
+          </w:rPr>
+          <w:t xml:space="preserve">https://journals.lww.com/jhmonline/fulltext/2025/05000/organizational_resilience_in_healthcare__a_scoping.4.aspx</w:t>
+        </w:r>
+      </w:hyperlink>
+    </w:p>
+    <w:bookmarkEnd w:id="153"/>
+    <w:bookmarkStart w:id="155" w:name="ref-valiaiev2025"/>
+    <w:p>
+      <w:pPr>
+        <w:pStyle w:val="Bibliography"/>
+      </w:pPr>
+      <w:r>
+        <w:t xml:space="preserve">58.</w:t>
+      </w:r>
+      <w:r>
+        <w:t xml:space="preserve"> </w:t>
+      </w:r>
+      <w:r>
+        <w:t xml:space="preserve">	</w:t>
+      </w:r>
+      <w:r>
         <w:t xml:space="preserve">Valiaiev D.</w:t>
       </w:r>
       <w:r>
@@ -7194,7 +7907,7 @@
       <w:r>
         <w:t xml:space="preserve"> </w:t>
       </w:r>
-      <w:hyperlink r:id="rId148">
+      <w:hyperlink r:id="rId154">
         <w:r>
           <w:rPr>
             <w:rStyle w:val="Hyperlink"/>
@@ -7203,14 +7916,14 @@
         </w:r>
       </w:hyperlink>
     </w:p>
-    <w:bookmarkEnd w:id="149"/>
-    <w:bookmarkStart w:id="151" w:name="ref-betha2023"/>
+    <w:bookmarkEnd w:id="155"/>
+    <w:bookmarkStart w:id="157" w:name="ref-betha2023"/>
     <w:p>
       <w:pPr>
         <w:pStyle w:val="Bibliography"/>
       </w:pPr>
       <w:r>
-        <w:t xml:space="preserve">56.</w:t>
+        <w:t xml:space="preserve">59.</w:t>
       </w:r>
       <w:r>
         <w:t xml:space="preserve"> </w:t>
@@ -7233,7 +7946,7 @@
       <w:r>
         <w:t xml:space="preserve"> </w:t>
       </w:r>
-      <w:hyperlink r:id="rId150">
+      <w:hyperlink r:id="rId156">
         <w:r>
           <w:rPr>
             <w:rStyle w:val="Hyperlink"/>
@@ -7242,14 +7955,14 @@
         </w:r>
       </w:hyperlink>
     </w:p>
-    <w:bookmarkEnd w:id="151"/>
-    <w:bookmarkStart w:id="153" w:name="ref-kottam2025"/>
+    <w:bookmarkEnd w:id="157"/>
+    <w:bookmarkStart w:id="159" w:name="ref-kottam2025"/>
     <w:p>
       <w:pPr>
         <w:pStyle w:val="Bibliography"/>
       </w:pPr>
       <w:r>
-        <w:t xml:space="preserve">57.</w:t>
+        <w:t xml:space="preserve">60.</w:t>
       </w:r>
       <w:r>
         <w:t xml:space="preserve"> </w:t>
@@ -7272,129 +7985,12 @@
       <w:r>
         <w:t xml:space="preserve"> </w:t>
       </w:r>
-      <w:hyperlink r:id="rId152">
+      <w:hyperlink r:id="rId158">
         <w:r>
           <w:rPr>
             <w:rStyle w:val="Hyperlink"/>
           </w:rPr>
           <w:t xml:space="preserve">https://ieeexplore.ieee.org/abstract/document/11402102/</w:t>
-        </w:r>
-      </w:hyperlink>
-    </w:p>
-    <w:bookmarkEnd w:id="153"/>
-    <w:bookmarkStart w:id="155" w:name="ref-ignatowicz2023"/>
-    <w:p>
-      <w:pPr>
-        <w:pStyle w:val="Bibliography"/>
-      </w:pPr>
-      <w:r>
-        <w:t xml:space="preserve">58.</w:t>
-      </w:r>
-      <w:r>
-        <w:t xml:space="preserve"> </w:t>
-      </w:r>
-      <w:r>
-        <w:t xml:space="preserve">	</w:t>
-      </w:r>
-      <w:r>
-        <w:t xml:space="preserve">Ignatowicz A, Tarrant C, Mannion R, El-Sawy D, et al.</w:t>
-      </w:r>
-      <w:r>
-        <w:t xml:space="preserve"> </w:t>
-      </w:r>
-      <w:r>
-        <w:t xml:space="preserve">Organizational resilience in healthcare: a review and descriptive narrative synthesis of approaches to resilience measurement and assessment in empirical studies</w:t>
-      </w:r>
-      <w:r>
-        <w:t xml:space="preserve">. BMC Health Services Research [Internet]. 2023;23:242. Available from:</w:t>
-      </w:r>
-      <w:r>
-        <w:t xml:space="preserve"> </w:t>
-      </w:r>
-      <w:hyperlink r:id="rId154">
-        <w:r>
-          <w:rPr>
-            <w:rStyle w:val="Hyperlink"/>
-          </w:rPr>
-          <w:t xml:space="preserve">https://link.springer.com/article/10.1186/s12913-023-09242-9</w:t>
-        </w:r>
-      </w:hyperlink>
-    </w:p>
-    <w:bookmarkEnd w:id="155"/>
-    <w:bookmarkStart w:id="157" w:name="ref-ratliff2025"/>
-    <w:p>
-      <w:pPr>
-        <w:pStyle w:val="Bibliography"/>
-      </w:pPr>
-      <w:r>
-        <w:t xml:space="preserve">59.</w:t>
-      </w:r>
-      <w:r>
-        <w:t xml:space="preserve"> </w:t>
-      </w:r>
-      <w:r>
-        <w:t xml:space="preserve">	</w:t>
-      </w:r>
-      <w:r>
-        <w:t xml:space="preserve">Ratliff HC, Lee KA, Buchbinder M, Kelly LA, et al.</w:t>
-      </w:r>
-      <w:r>
-        <w:t xml:space="preserve"> </w:t>
-      </w:r>
-      <w:r>
-        <w:t xml:space="preserve">Organizational resilience in healthcare: a scoping review</w:t>
-      </w:r>
-      <w:r>
-        <w:t xml:space="preserve">. Journal of Healthcare Management [Internet]. 2025;70(3). Available from:</w:t>
-      </w:r>
-      <w:r>
-        <w:t xml:space="preserve"> </w:t>
-      </w:r>
-      <w:hyperlink r:id="rId156">
-        <w:r>
-          <w:rPr>
-            <w:rStyle w:val="Hyperlink"/>
-          </w:rPr>
-          <w:t xml:space="preserve">https://journals.lww.com/jhmonline/fulltext/2025/05000/organizational_resilience_in_healthcare__a_scoping.4.aspx</w:t>
-        </w:r>
-      </w:hyperlink>
-    </w:p>
-    <w:bookmarkEnd w:id="157"/>
-    <w:bookmarkStart w:id="159" w:name="ref-ellis2026"/>
-    <w:p>
-      <w:pPr>
-        <w:pStyle w:val="Bibliography"/>
-      </w:pPr>
-      <w:r>
-        <w:t xml:space="preserve">60.</w:t>
-      </w:r>
-      <w:r>
-        <w:t xml:space="preserve"> </w:t>
-      </w:r>
-      <w:r>
-        <w:t xml:space="preserve">	</w:t>
-      </w:r>
-      <w:r>
-        <w:t xml:space="preserve">Ellis LA, Lyng HB, Haraldseid-Driftland C, Saba M, et al.</w:t>
-      </w:r>
-      <w:r>
-        <w:t xml:space="preserve"> </w:t>
-      </w:r>
-      <w:r>
-        <w:t xml:space="preserve">From theory to measurement: Development and initial validation of the Resilience in Healthcare Capacities Assessment (RHCA)</w:t>
-      </w:r>
-      <w:r>
-        <w:t xml:space="preserve">. Applied Ergonomics [Internet]. 2026; Available from:</w:t>
-      </w:r>
-      <w:r>
-        <w:t xml:space="preserve"> </w:t>
-      </w:r>
-      <w:hyperlink r:id="rId158">
-        <w:r>
-          <w:rPr>
-            <w:rStyle w:val="Hyperlink"/>
-          </w:rPr>
-          <w:t xml:space="preserve">https://www.sciencedirect.com/science/article/pii/S0003687026000463</w:t>
         </w:r>
       </w:hyperlink>
     </w:p>
@@ -7630,7 +8226,7 @@
       </w:hyperlink>
     </w:p>
     <w:bookmarkEnd w:id="171"/>
-    <w:bookmarkStart w:id="173" w:name="ref-ipeirotis2025"/>
+    <w:bookmarkStart w:id="173" w:name="ref-zimmermann2017"/>
     <w:p>
       <w:pPr>
         <w:pStyle w:val="Bibliography"/>
@@ -7645,6 +8241,45 @@
         <w:t xml:space="preserve">	</w:t>
       </w:r>
       <w:r>
+        <w:t xml:space="preserve">Zimmermann S, Rentrop C.</w:t>
+      </w:r>
+      <w:r>
+        <w:t xml:space="preserve"> </w:t>
+      </w:r>
+      <w:r>
+        <w:t xml:space="preserve">On the emergence of shadow IT: A transaction cost-based approach</w:t>
+      </w:r>
+      <w:r>
+        <w:t xml:space="preserve">. Journal of Information Systems [Internet]. 2017;31(1):79–96. Available from:</w:t>
+      </w:r>
+      <w:r>
+        <w:t xml:space="preserve"> </w:t>
+      </w:r>
+      <w:hyperlink r:id="rId172">
+        <w:r>
+          <w:rPr>
+            <w:rStyle w:val="Hyperlink"/>
+          </w:rPr>
+          <w:t xml:space="preserve">https://publications.aaahq.org/jis/article-abstract/31/1/79/1070</w:t>
+        </w:r>
+      </w:hyperlink>
+    </w:p>
+    <w:bookmarkEnd w:id="173"/>
+    <w:bookmarkStart w:id="175" w:name="ref-ipeirotis2025"/>
+    <w:p>
+      <w:pPr>
+        <w:pStyle w:val="Bibliography"/>
+      </w:pPr>
+      <w:r>
+        <w:t xml:space="preserve">68.</w:t>
+      </w:r>
+      <w:r>
+        <w:t xml:space="preserve"> </w:t>
+      </w:r>
+      <w:r>
+        <w:t xml:space="preserve">	</w:t>
+      </w:r>
+      <w:r>
         <w:t xml:space="preserve">Ipeirotis &amp;Z P.</w:t>
       </w:r>
       <w:r>
@@ -7659,7 +8294,7 @@
       <w:r>
         <w:t xml:space="preserve"> </w:t>
       </w:r>
-      <w:hyperlink r:id="rId172">
+      <w:hyperlink r:id="rId174">
         <w:r>
           <w:rPr>
             <w:rStyle w:val="Hyperlink"/>
@@ -7668,14 +8303,14 @@
         </w:r>
       </w:hyperlink>
     </w:p>
-    <w:bookmarkEnd w:id="173"/>
-    <w:bookmarkStart w:id="175" w:name="ref-ibm2022"/>
+    <w:bookmarkEnd w:id="175"/>
+    <w:bookmarkStart w:id="177" w:name="ref-ibm2022"/>
     <w:p>
       <w:pPr>
         <w:pStyle w:val="Bibliography"/>
       </w:pPr>
       <w:r>
-        <w:t xml:space="preserve">68.</w:t>
+        <w:t xml:space="preserve">69.</w:t>
       </w:r>
       <w:r>
         <w:t xml:space="preserve"> </w:t>
@@ -7710,7 +8345,7 @@
       <w:r>
         <w:t xml:space="preserve"> </w:t>
       </w:r>
-      <w:hyperlink r:id="rId174">
+      <w:hyperlink r:id="rId176">
         <w:r>
           <w:rPr>
             <w:rStyle w:val="Hyperlink"/>
@@ -7719,14 +8354,14 @@
         </w:r>
       </w:hyperlink>
     </w:p>
-    <w:bookmarkEnd w:id="175"/>
-    <w:bookmarkStart w:id="177" w:name="ref-strickland2019"/>
+    <w:bookmarkEnd w:id="177"/>
+    <w:bookmarkStart w:id="179" w:name="ref-strickland2019"/>
     <w:p>
       <w:pPr>
         <w:pStyle w:val="Bibliography"/>
       </w:pPr>
       <w:r>
-        <w:t xml:space="preserve">69.</w:t>
+        <w:t xml:space="preserve">70.</w:t>
       </w:r>
       <w:r>
         <w:t xml:space="preserve"> </w:t>
@@ -7749,7 +8384,7 @@
       <w:r>
         <w:t xml:space="preserve"> </w:t>
       </w:r>
-      <w:hyperlink r:id="rId176">
+      <w:hyperlink r:id="rId178">
         <w:r>
           <w:rPr>
             <w:rStyle w:val="Hyperlink"/>
@@ -7758,14 +8393,14 @@
         </w:r>
       </w:hyperlink>
     </w:p>
-    <w:bookmarkEnd w:id="177"/>
-    <w:bookmarkStart w:id="179" w:name="ref-lavito2021"/>
+    <w:bookmarkEnd w:id="179"/>
+    <w:bookmarkStart w:id="181" w:name="ref-lavito2021"/>
     <w:p>
       <w:pPr>
         <w:pStyle w:val="Bibliography"/>
       </w:pPr>
       <w:r>
-        <w:t xml:space="preserve">70.</w:t>
+        <w:t xml:space="preserve">71.</w:t>
       </w:r>
       <w:r>
         <w:t xml:space="preserve"> </w:t>
@@ -7800,7 +8435,7 @@
       <w:r>
         <w:t xml:space="preserve"> </w:t>
       </w:r>
-      <w:hyperlink r:id="rId178">
+      <w:hyperlink r:id="rId180">
         <w:r>
           <w:rPr>
             <w:rStyle w:val="Hyperlink"/>
@@ -7809,14 +8444,14 @@
         </w:r>
       </w:hyperlink>
     </w:p>
-    <w:bookmarkEnd w:id="179"/>
-    <w:bookmarkStart w:id="181" w:name="ref-acchiardo2021"/>
+    <w:bookmarkEnd w:id="181"/>
+    <w:bookmarkStart w:id="183" w:name="ref-acchiardo2021"/>
     <w:p>
       <w:pPr>
         <w:pStyle w:val="Bibliography"/>
       </w:pPr>
       <w:r>
-        <w:t xml:space="preserve">71.</w:t>
+        <w:t xml:space="preserve">72.</w:t>
       </w:r>
       <w:r>
         <w:t xml:space="preserve"> </w:t>
@@ -7839,7 +8474,7 @@
       <w:r>
         <w:t xml:space="preserve"> </w:t>
       </w:r>
-      <w:hyperlink r:id="rId180">
+      <w:hyperlink r:id="rId182">
         <w:r>
           <w:rPr>
             <w:rStyle w:val="Hyperlink"/>
@@ -7848,14 +8483,14 @@
         </w:r>
       </w:hyperlink>
     </w:p>
-    <w:bookmarkEnd w:id="181"/>
-    <w:bookmarkStart w:id="183" w:name="ref-yang2020"/>
+    <w:bookmarkEnd w:id="183"/>
+    <w:bookmarkStart w:id="185" w:name="ref-yang2020"/>
     <w:p>
       <w:pPr>
         <w:pStyle w:val="Bibliography"/>
       </w:pPr>
       <w:r>
-        <w:t xml:space="preserve">72.</w:t>
+        <w:t xml:space="preserve">73.</w:t>
       </w:r>
       <w:r>
         <w:t xml:space="preserve"> </w:t>
@@ -7881,7 +8516,7 @@
       <w:r>
         <w:t xml:space="preserve"> </w:t>
       </w:r>
-      <w:hyperlink r:id="rId182">
+      <w:hyperlink r:id="rId184">
         <w:r>
           <w:rPr>
             <w:rStyle w:val="Hyperlink"/>
@@ -7890,9 +8525,9 @@
         </w:r>
       </w:hyperlink>
     </w:p>
-    <w:bookmarkEnd w:id="183"/>
-    <w:bookmarkEnd w:id="184"/>
     <w:bookmarkEnd w:id="185"/>
+    <w:bookmarkEnd w:id="186"/>
+    <w:bookmarkEnd w:id="187"/>
     <w:sectPr>
       <w:footnotePr>
         <w:numRestart w:val="eachSect"/>

</xml_diff>

<commit_message>
fix: set all DOCX headings to black Times New Roman with academic sizes
Reference doc updated:
- All heading colors: black (was teal/blue theme color)
- Theme accent colors: black
- Title/H1: 14pt, H2: 13pt, H3: 12pt (was 28/20/16pt)
- All fonts consistently Times New Roman

Refs #506

Co-Authored-By: Claude Opus 4.6 (1M context) <noreply@anthropic.com>
</commit_message>
<xml_diff>
--- a/paper.docx
+++ b/paper.docx
@@ -8922,7 +8922,7 @@
   <w:docDefaults>
     <w:rPrDefault>
       <w:rPr>
-        <w:rFonts w:asciiTheme="minorHAnsi" w:cstheme="minorBidi" w:eastAsiaTheme="minorEastAsia" w:hAnsiTheme="minorHAnsi"/>
+        <w:rFonts w:ascii="Times New Roman" w:cstheme="minorBidi" w:eastAsiaTheme="minorEastAsia" w:hAnsi="Times New Roman"/>
         <w:sz w:val="24"/>
         <w:szCs w:val="24"/>
         <w:lang w:bidi="ar-SA" w:eastAsia="zh-CN" w:val="en-US"/>
@@ -8984,9 +8984,9 @@
       <w:jc w:val="center"/>
     </w:pPr>
     <w:rPr>
-      <w:rFonts w:asciiTheme="majorHAnsi" w:cstheme="majorBidi" w:eastAsiaTheme="majorEastAsia" w:hAnsiTheme="majorHAnsi"/>
-      <w:sz w:val="56"/>
-      <w:szCs w:val="56"/>
+      <w:rFonts w:ascii="Times New Roman" w:cstheme="majorBidi" w:eastAsiaTheme="majorEastAsia" w:hAnsi="Times New Roman"/>
+      <w:sz w:val="28"/>
+      <w:szCs w:val="28"/>
     </w:rPr>
   </w:style>
   <w:style w:customStyle="1" w:styleId="TitleChar" w:type="character">
@@ -8996,9 +8996,9 @@
     <w:uiPriority w:val="10"/>
     <w:rsid w:val="00A10FD9"/>
     <w:rPr>
-      <w:rFonts w:asciiTheme="majorHAnsi" w:cstheme="majorBidi" w:eastAsiaTheme="majorEastAsia" w:hAnsiTheme="majorHAnsi"/>
-      <w:sz w:val="56"/>
-      <w:szCs w:val="56"/>
+      <w:rFonts w:ascii="Times New Roman" w:cstheme="majorBidi" w:eastAsiaTheme="majorEastAsia" w:hAnsi="Times New Roman"/>
+      <w:sz w:val="28"/>
+      <w:szCs w:val="28"/>
     </w:rPr>
   </w:style>
   <w:style w:styleId="Subtitle" w:type="paragraph">
@@ -9015,7 +9015,7 @@
       </w:numPr>
     </w:pPr>
     <w:rPr>
-      <w:rFonts w:cstheme="majorBidi" w:eastAsiaTheme="majorEastAsia"/>
+      <w:rFonts w:ascii="Times New Roman" w:cstheme="majorBidi" w:eastAsiaTheme="majorEastAsia" w:hAnsi="Times New Roman"/>
       <w:spacing w:val="15"/>
       <w:sz w:val="28"/>
       <w:szCs w:val="28"/>
@@ -9028,8 +9028,8 @@
     <w:uiPriority w:val="11"/>
     <w:rsid w:val="00A10FD9"/>
     <w:rPr>
-      <w:rFonts w:cstheme="majorBidi" w:eastAsiaTheme="majorEastAsia"/>
-      <w:color w:themeColor="text1" w:themeTint="A6" w:val="595959"/>
+      <w:rFonts w:ascii="Times New Roman" w:cstheme="majorBidi" w:eastAsiaTheme="majorEastAsia" w:hAnsi="Times New Roman"/>
+      <w:color w:themeTint="A6" w:val="000000"/>
       <w:spacing w:val="15"/>
       <w:sz w:val="28"/>
       <w:szCs w:val="28"/>
@@ -9118,10 +9118,10 @@
       <w:outlineLvl w:val="0"/>
     </w:pPr>
     <w:rPr>
-      <w:rFonts w:asciiTheme="majorHAnsi" w:cstheme="majorBidi" w:eastAsiaTheme="majorEastAsia" w:hAnsiTheme="majorHAnsi"/>
-      <w:color w:themeColor="accent1" w:themeShade="BF" w:val="0F4761"/>
-      <w:sz w:val="40"/>
-      <w:szCs w:val="40"/>
+      <w:rFonts w:ascii="Times New Roman" w:cstheme="majorBidi" w:eastAsiaTheme="majorEastAsia" w:hAnsi="Times New Roman"/>
+      <w:color w:val="000000"/>
+      <w:sz w:val="28"/>
+      <w:szCs w:val="28"/>
     </w:rPr>
   </w:style>
   <w:style w:styleId="Heading2" w:type="paragraph">
@@ -9141,10 +9141,10 @@
       <w:outlineLvl w:val="1"/>
     </w:pPr>
     <w:rPr>
-      <w:rFonts w:asciiTheme="majorHAnsi" w:cstheme="majorBidi" w:eastAsiaTheme="majorEastAsia" w:hAnsiTheme="majorHAnsi"/>
-      <w:color w:themeColor="accent1" w:themeShade="BF" w:val="0F4761"/>
-      <w:sz w:val="32"/>
-      <w:szCs w:val="32"/>
+      <w:rFonts w:ascii="Times New Roman" w:cstheme="majorBidi" w:eastAsiaTheme="majorEastAsia" w:hAnsi="Times New Roman"/>
+      <w:color w:val="000000"/>
+      <w:sz w:val="26"/>
+      <w:szCs w:val="26"/>
     </w:rPr>
   </w:style>
   <w:style w:styleId="Heading3" w:type="paragraph">
@@ -9164,10 +9164,10 @@
       <w:outlineLvl w:val="2"/>
     </w:pPr>
     <w:rPr>
-      <w:rFonts w:cstheme="majorBidi" w:eastAsiaTheme="majorEastAsia"/>
-      <w:color w:themeColor="accent1" w:themeShade="BF" w:val="0F4761"/>
-      <w:sz w:val="28"/>
-      <w:szCs w:val="28"/>
+      <w:rFonts w:ascii="Times New Roman" w:cstheme="majorBidi" w:eastAsiaTheme="majorEastAsia" w:hAnsi="Times New Roman"/>
+      <w:color w:val="000000"/>
+      <w:sz w:val="24"/>
+      <w:szCs w:val="24"/>
     </w:rPr>
   </w:style>
   <w:style w:styleId="Heading4" w:type="paragraph">
@@ -9187,10 +9187,10 @@
       <w:outlineLvl w:val="3"/>
     </w:pPr>
     <w:rPr>
-      <w:rFonts w:cstheme="majorBidi" w:eastAsiaTheme="majorEastAsia"/>
+      <w:rFonts w:ascii="Times New Roman" w:cstheme="majorBidi" w:eastAsiaTheme="majorEastAsia" w:hAnsi="Times New Roman"/>
       <w:i/>
       <w:iCs/>
-      <w:color w:themeColor="accent1" w:themeShade="BF" w:val="0F4761"/>
+      <w:color w:val="000000"/>
     </w:rPr>
   </w:style>
   <w:style w:styleId="Heading5" w:type="paragraph">
@@ -9210,8 +9210,8 @@
       <w:outlineLvl w:val="4"/>
     </w:pPr>
     <w:rPr>
-      <w:rFonts w:cstheme="majorBidi" w:eastAsiaTheme="majorEastAsia"/>
-      <w:color w:themeColor="accent1" w:themeShade="BF" w:val="0F4761"/>
+      <w:rFonts w:ascii="Times New Roman" w:cstheme="majorBidi" w:eastAsiaTheme="majorEastAsia" w:hAnsi="Times New Roman"/>
+      <w:color w:val="000000"/>
     </w:rPr>
   </w:style>
   <w:style w:styleId="Heading6" w:type="paragraph">
@@ -9231,10 +9231,10 @@
       <w:outlineLvl w:val="5"/>
     </w:pPr>
     <w:rPr>
-      <w:rFonts w:cstheme="majorBidi" w:eastAsiaTheme="majorEastAsia"/>
+      <w:rFonts w:ascii="Times New Roman" w:cstheme="majorBidi" w:eastAsiaTheme="majorEastAsia" w:hAnsi="Times New Roman"/>
       <w:i/>
       <w:iCs/>
-      <w:color w:themeColor="text1" w:themeTint="A6" w:val="595959"/>
+      <w:color w:themeTint="A6" w:val="000000"/>
     </w:rPr>
   </w:style>
   <w:style w:styleId="Heading7" w:type="paragraph">
@@ -9254,8 +9254,8 @@
       <w:outlineLvl w:val="6"/>
     </w:pPr>
     <w:rPr>
-      <w:rFonts w:cstheme="majorBidi" w:eastAsiaTheme="majorEastAsia"/>
-      <w:color w:themeColor="text1" w:themeTint="A6" w:val="595959"/>
+      <w:rFonts w:ascii="Times New Roman" w:cstheme="majorBidi" w:eastAsiaTheme="majorEastAsia" w:hAnsi="Times New Roman"/>
+      <w:color w:themeTint="A6" w:val="000000"/>
     </w:rPr>
   </w:style>
   <w:style w:styleId="Heading8" w:type="paragraph">
@@ -9275,10 +9275,10 @@
       <w:outlineLvl w:val="7"/>
     </w:pPr>
     <w:rPr>
-      <w:rFonts w:cstheme="majorBidi" w:eastAsiaTheme="majorEastAsia"/>
+      <w:rFonts w:ascii="Times New Roman" w:cstheme="majorBidi" w:eastAsiaTheme="majorEastAsia" w:hAnsi="Times New Roman"/>
       <w:i/>
       <w:iCs/>
-      <w:color w:themeColor="text1" w:themeTint="D8" w:val="272727"/>
+      <w:color w:themeTint="D8" w:val="000000"/>
     </w:rPr>
   </w:style>
   <w:style w:styleId="Heading9" w:type="paragraph">
@@ -9298,8 +9298,8 @@
       <w:outlineLvl w:val="8"/>
     </w:pPr>
     <w:rPr>
-      <w:rFonts w:cstheme="majorBidi" w:eastAsiaTheme="majorEastAsia"/>
-      <w:color w:themeColor="text1" w:themeTint="D8" w:val="272727"/>
+      <w:rFonts w:ascii="Times New Roman" w:cstheme="majorBidi" w:eastAsiaTheme="majorEastAsia" w:hAnsi="Times New Roman"/>
+      <w:color w:themeTint="D8" w:val="000000"/>
     </w:rPr>
   </w:style>
   <w:style w:customStyle="1" w:styleId="Heading1Char" w:type="character">
@@ -9309,10 +9309,10 @@
     <w:uiPriority w:val="9"/>
     <w:rsid w:val="00A10FD9"/>
     <w:rPr>
-      <w:rFonts w:asciiTheme="majorHAnsi" w:cstheme="majorBidi" w:eastAsiaTheme="majorEastAsia" w:hAnsiTheme="majorHAnsi"/>
-      <w:color w:themeColor="accent1" w:themeShade="BF" w:val="0F4761"/>
-      <w:sz w:val="40"/>
-      <w:szCs w:val="40"/>
+      <w:rFonts w:ascii="Times New Roman" w:cstheme="majorBidi" w:eastAsiaTheme="majorEastAsia" w:hAnsi="Times New Roman"/>
+      <w:color w:val="000000"/>
+      <w:sz w:val="28"/>
+      <w:szCs w:val="28"/>
     </w:rPr>
   </w:style>
   <w:style w:customStyle="1" w:styleId="Heading2Char" w:type="character">
@@ -9323,10 +9323,10 @@
     <w:semiHidden/>
     <w:rsid w:val="00A10FD9"/>
     <w:rPr>
-      <w:rFonts w:asciiTheme="majorHAnsi" w:cstheme="majorBidi" w:eastAsiaTheme="majorEastAsia" w:hAnsiTheme="majorHAnsi"/>
-      <w:color w:themeColor="accent1" w:themeShade="BF" w:val="0F4761"/>
-      <w:sz w:val="32"/>
-      <w:szCs w:val="32"/>
+      <w:rFonts w:ascii="Times New Roman" w:cstheme="majorBidi" w:eastAsiaTheme="majorEastAsia" w:hAnsi="Times New Roman"/>
+      <w:color w:val="000000"/>
+      <w:sz w:val="26"/>
+      <w:szCs w:val="26"/>
     </w:rPr>
   </w:style>
   <w:style w:customStyle="1" w:styleId="Heading3Char" w:type="character">
@@ -9337,10 +9337,10 @@
     <w:semiHidden/>
     <w:rsid w:val="00A10FD9"/>
     <w:rPr>
-      <w:rFonts w:cstheme="majorBidi" w:eastAsiaTheme="majorEastAsia"/>
-      <w:color w:themeColor="accent1" w:themeShade="BF" w:val="0F4761"/>
-      <w:sz w:val="28"/>
-      <w:szCs w:val="28"/>
+      <w:rFonts w:ascii="Times New Roman" w:cstheme="majorBidi" w:eastAsiaTheme="majorEastAsia" w:hAnsi="Times New Roman"/>
+      <w:color w:val="000000"/>
+      <w:sz w:val="24"/>
+      <w:szCs w:val="24"/>
     </w:rPr>
   </w:style>
   <w:style w:customStyle="1" w:styleId="Heading4Char" w:type="character">
@@ -9351,10 +9351,10 @@
     <w:semiHidden/>
     <w:rsid w:val="00A10FD9"/>
     <w:rPr>
-      <w:rFonts w:cstheme="majorBidi" w:eastAsiaTheme="majorEastAsia"/>
+      <w:rFonts w:ascii="Times New Roman" w:cstheme="majorBidi" w:eastAsiaTheme="majorEastAsia" w:hAnsi="Times New Roman"/>
       <w:i/>
       <w:iCs/>
-      <w:color w:themeColor="accent1" w:themeShade="BF" w:val="0F4761"/>
+      <w:color w:val="000000"/>
     </w:rPr>
   </w:style>
   <w:style w:customStyle="1" w:styleId="Heading5Char" w:type="character">
@@ -9365,8 +9365,8 @@
     <w:semiHidden/>
     <w:rsid w:val="00A10FD9"/>
     <w:rPr>
-      <w:rFonts w:cstheme="majorBidi" w:eastAsiaTheme="majorEastAsia"/>
-      <w:color w:themeColor="accent1" w:themeShade="BF" w:val="0F4761"/>
+      <w:rFonts w:ascii="Times New Roman" w:cstheme="majorBidi" w:eastAsiaTheme="majorEastAsia" w:hAnsi="Times New Roman"/>
+      <w:color w:val="000000"/>
     </w:rPr>
   </w:style>
   <w:style w:customStyle="1" w:styleId="Heading6Char" w:type="character">
@@ -9377,10 +9377,10 @@
     <w:semiHidden/>
     <w:rsid w:val="00A10FD9"/>
     <w:rPr>
-      <w:rFonts w:cstheme="majorBidi" w:eastAsiaTheme="majorEastAsia"/>
+      <w:rFonts w:ascii="Times New Roman" w:cstheme="majorBidi" w:eastAsiaTheme="majorEastAsia" w:hAnsi="Times New Roman"/>
       <w:i/>
       <w:iCs/>
-      <w:color w:themeColor="text1" w:themeTint="A6" w:val="595959"/>
+      <w:color w:themeTint="A6" w:val="000000"/>
     </w:rPr>
   </w:style>
   <w:style w:customStyle="1" w:styleId="Heading7Char" w:type="character">
@@ -9391,8 +9391,8 @@
     <w:semiHidden/>
     <w:rsid w:val="00A10FD9"/>
     <w:rPr>
-      <w:rFonts w:cstheme="majorBidi" w:eastAsiaTheme="majorEastAsia"/>
-      <w:color w:themeColor="text1" w:themeTint="A6" w:val="595959"/>
+      <w:rFonts w:ascii="Times New Roman" w:cstheme="majorBidi" w:eastAsiaTheme="majorEastAsia" w:hAnsi="Times New Roman"/>
+      <w:color w:themeTint="A6" w:val="000000"/>
     </w:rPr>
   </w:style>
   <w:style w:customStyle="1" w:styleId="Heading8Char" w:type="character">
@@ -9403,10 +9403,10 @@
     <w:semiHidden/>
     <w:rsid w:val="00A10FD9"/>
     <w:rPr>
-      <w:rFonts w:cstheme="majorBidi" w:eastAsiaTheme="majorEastAsia"/>
+      <w:rFonts w:ascii="Times New Roman" w:cstheme="majorBidi" w:eastAsiaTheme="majorEastAsia" w:hAnsi="Times New Roman"/>
       <w:i/>
       <w:iCs/>
-      <w:color w:themeColor="text1" w:themeTint="D8" w:val="272727"/>
+      <w:color w:themeTint="D8" w:val="000000"/>
     </w:rPr>
   </w:style>
   <w:style w:customStyle="1" w:styleId="Heading9Char" w:type="character">
@@ -9417,8 +9417,8 @@
     <w:semiHidden/>
     <w:rsid w:val="00A10FD9"/>
     <w:rPr>
-      <w:rFonts w:cstheme="majorBidi" w:eastAsiaTheme="majorEastAsia"/>
-      <w:color w:themeColor="text1" w:themeTint="D8" w:val="272727"/>
+      <w:rFonts w:ascii="Times New Roman" w:cstheme="majorBidi" w:eastAsiaTheme="majorEastAsia" w:hAnsi="Times New Roman"/>
+      <w:color w:themeTint="D8" w:val="000000"/>
     </w:rPr>
   </w:style>
   <w:style w:styleId="BlockText" w:type="paragraph">
@@ -9541,7 +9541,7 @@
     <w:name w:val="Verbatim Char"/>
     <w:basedOn w:val="BodyTextChar"/>
     <w:rPr>
-      <w:rFonts w:ascii="Consolas" w:hAnsi="Consolas"/>
+      <w:rFonts w:ascii="Times New Roman" w:hAnsi="Times New Roman"/>
       <w:sz w:val="22"/>
     </w:rPr>
   </w:style>
@@ -9560,7 +9560,7 @@
     <w:name w:val="Hyperlink"/>
     <w:basedOn w:val="BodyTextChar"/>
     <w:rPr>
-      <w:color w:themeColor="accent1" w:val="4F81BD"/>
+      <w:color w:val="000000"/>
     </w:rPr>
   </w:style>
   <w:style w:styleId="TOCHeading" w:type="paragraph">
@@ -9575,10 +9575,10 @@
       <w:outlineLvl w:val="9"/>
     </w:pPr>
     <w:rPr>
-      <w:rFonts w:asciiTheme="majorHAnsi" w:cstheme="majorBidi" w:eastAsiaTheme="majorEastAsia" w:hAnsiTheme="majorHAnsi"/>
+      <w:rFonts w:ascii="Times New Roman" w:cstheme="majorBidi" w:eastAsiaTheme="majorEastAsia" w:hAnsi="Times New Roman"/>
       <w:b w:val="0"/>
       <w:bCs w:val="0"/>
-      <w:color w:themeColor="accent1" w:themeShade="BF" w:val="365F91"/>
+      <w:color w:val="000000"/>
     </w:rPr>
   </w:style>
   <w:style w:type="paragraph" w:customStyle="1" w:styleId="SourceCode">

</xml_diff>